<commit_message>
Update IoT design with figures and screenshots
</commit_message>
<xml_diff>
--- a/iot/artifacts/meeting1/TestPlan.docx
+++ b/iot/artifacts/meeting1/TestPlan.docx
@@ -1,6 +1,6 @@
 
 <file path=word/document.xml><?xml version="1.0" encoding="utf-8"?>
-<w:document xmlns:wpc="http://schemas.microsoft.com/office/word/2010/wordprocessingCanvas" xmlns:cx="http://schemas.microsoft.com/office/drawing/2014/chartex" xmlns:cx1="http://schemas.microsoft.com/office/drawing/2015/9/8/chartex" xmlns:cx2="http://schemas.microsoft.com/office/drawing/2015/10/21/chartex" xmlns:cx3="http://schemas.microsoft.com/office/drawing/2016/5/9/chartex" xmlns:cx4="http://schemas.microsoft.com/office/drawing/2016/5/10/chartex" xmlns:cx5="http://schemas.microsoft.com/office/drawing/2016/5/11/chartex" xmlns:cx6="http://schemas.microsoft.com/office/drawing/2016/5/12/chartex" xmlns:cx7="http://schemas.microsoft.com/office/drawing/2016/5/13/chartex" xmlns:cx8="http://schemas.microsoft.com/office/drawing/2016/5/14/chartex" xmlns:mc="http://schemas.openxmlformats.org/markup-compatibility/2006" xmlns:aink="http://schemas.microsoft.com/office/drawing/2016/ink" xmlns:am3d="http://schemas.microsoft.com/office/drawing/2017/model3d" xmlns:o="urn:schemas-microsoft-com:office:office" xmlns:oel="http://schemas.microsoft.com/office/2019/extlst" xmlns:r="http://schemas.openxmlformats.org/officeDocument/2006/relationships" xmlns:m="http://schemas.openxmlformats.org/officeDocument/2006/math" xmlns:v="urn:schemas-microsoft-com:vml" xmlns:wp14="http://schemas.microsoft.com/office/word/2010/wordprocessingDrawing" xmlns:wp="http://schemas.openxmlformats.org/drawingml/2006/wordprocessingDrawing" xmlns:w10="urn:schemas-microsoft-com:office:word" xmlns:w="http://schemas.openxmlformats.org/wordprocessingml/2006/main" xmlns:w14="http://schemas.microsoft.com/office/word/2010/wordml" xmlns:w15="http://schemas.microsoft.com/office/word/2012/wordml" xmlns:w16cei="http://schemas.microsoft.com/office/word/2026/wordml/cei" xmlns:w16cex="http://schemas.microsoft.com/office/word/2018/wordml/cex" xmlns:w16cid="http://schemas.microsoft.com/office/word/2016/wordml/cid" xmlns:w16="http://schemas.microsoft.com/office/word/2018/wordml" xmlns:w16du="http://schemas.microsoft.com/office/word/2023/wordml/word16du" xmlns:w16sdtdh="http://schemas.microsoft.com/office/word/2020/wordml/sdtdatahash" xmlns:w16sdtfl="http://schemas.microsoft.com/office/word/2024/wordml/sdtformatlock" xmlns:w16se="http://schemas.microsoft.com/office/word/2015/wordml/symex" xmlns:wpg="http://schemas.microsoft.com/office/word/2010/wordprocessingGroup" xmlns:wpi="http://schemas.microsoft.com/office/word/2010/wordprocessingInk" xmlns:wne="http://schemas.microsoft.com/office/word/2006/wordml" xmlns:wps="http://schemas.microsoft.com/office/word/2010/wordprocessingShape" mc:Ignorable="w14 w15 w16se w16cid w16 w16cex w16sdtdh w16sdtfl w16du wp14">
+<w:document xmlns:wpc="http://schemas.microsoft.com/office/word/2010/wordprocessingCanvas" xmlns:cx="http://schemas.microsoft.com/office/drawing/2014/chartex" xmlns:cx1="http://schemas.microsoft.com/office/drawing/2015/9/8/chartex" xmlns:cx2="http://schemas.microsoft.com/office/drawing/2015/10/21/chartex" xmlns:cx3="http://schemas.microsoft.com/office/drawing/2016/5/9/chartex" xmlns:cx4="http://schemas.microsoft.com/office/drawing/2016/5/10/chartex" xmlns:cx5="http://schemas.microsoft.com/office/drawing/2016/5/11/chartex" xmlns:cx6="http://schemas.microsoft.com/office/drawing/2016/5/12/chartex" xmlns:cx7="http://schemas.microsoft.com/office/drawing/2016/5/13/chartex" xmlns:cx8="http://schemas.microsoft.com/office/drawing/2016/5/14/chartex" xmlns:mc="http://schemas.openxmlformats.org/markup-compatibility/2006" xmlns:aink="http://schemas.microsoft.com/office/drawing/2016/ink" xmlns:am3d="http://schemas.microsoft.com/office/drawing/2017/model3d" xmlns:o="urn:schemas-microsoft-com:office:office" xmlns:oel="http://schemas.microsoft.com/office/2019/extlst" xmlns:r="http://schemas.openxmlformats.org/officeDocument/2006/relationships" xmlns:m="http://schemas.openxmlformats.org/officeDocument/2006/math" xmlns:v="urn:schemas-microsoft-com:vml" xmlns:wp14="http://schemas.microsoft.com/office/word/2010/wordprocessingDrawing" xmlns:wp="http://schemas.openxmlformats.org/drawingml/2006/wordprocessingDrawing" xmlns:w10="urn:schemas-microsoft-com:office:word" xmlns:w="http://schemas.openxmlformats.org/wordprocessingml/2006/main" xmlns:w14="http://schemas.microsoft.com/office/word/2010/wordml" xmlns:w15="http://schemas.microsoft.com/office/word/2012/wordml" xmlns:w16cex="http://schemas.microsoft.com/office/word/2018/wordml/cex" xmlns:w16cid="http://schemas.microsoft.com/office/word/2016/wordml/cid" xmlns:w16="http://schemas.microsoft.com/office/word/2018/wordml" xmlns:w16du="http://schemas.microsoft.com/office/word/2023/wordml/word16du" xmlns:w16sdtdh="http://schemas.microsoft.com/office/word/2020/wordml/sdtdatahash" xmlns:w16sdtfl="http://schemas.microsoft.com/office/word/2024/wordml/sdtformatlock" xmlns:w16se="http://schemas.microsoft.com/office/word/2015/wordml/symex" xmlns:wpg="http://schemas.microsoft.com/office/word/2010/wordprocessingGroup" xmlns:wpi="http://schemas.microsoft.com/office/word/2010/wordprocessingInk" xmlns:wne="http://schemas.microsoft.com/office/word/2006/wordml" xmlns:wps="http://schemas.microsoft.com/office/word/2010/wordprocessingShape" mc:Ignorable="w14 w15 w16se w16cid w16 w16cex w16sdtdh w16sdtfl w16du wp14">
   <w:body>
     <w:p>
       <w:pPr>
@@ -43,7 +43,7 @@
         </w:rPr>
         <w:t xml:space="preserve">[GitHub]: </w:t>
       </w:r>
-      <w:hyperlink r:id="rId7">
+      <w:hyperlink r:id="rId8">
         <w:r>
           <w:rPr>
             <w:color w:val="0000FF"/>
@@ -104,7 +104,28 @@
         <w:t xml:space="preserve"> – IoT</w:t>
       </w:r>
     </w:p>
-    <w:p/>
+    <w:p>
+      <w:pPr>
+        <w:rPr>
+          <w:rFonts w:ascii="Arial" w:eastAsia="Arial" w:hAnsi="Arial" w:cs="Arial"/>
+          <w:b/>
+          <w:bCs/>
+          <w:sz w:val="32"/>
+          <w:szCs w:val="32"/>
+        </w:rPr>
+      </w:pPr>
+    </w:p>
+    <w:p>
+      <w:pPr>
+        <w:rPr>
+          <w:rFonts w:ascii="Arial" w:eastAsia="Arial" w:hAnsi="Arial" w:cs="Arial"/>
+          <w:b/>
+          <w:bCs/>
+          <w:sz w:val="32"/>
+          <w:szCs w:val="32"/>
+        </w:rPr>
+      </w:pPr>
+    </w:p>
     <w:p/>
     <w:p/>
     <w:p/>
@@ -112,11 +133,11 @@
       <w:pPr>
         <w:pStyle w:val="Rubrik1"/>
       </w:pPr>
-      <w:bookmarkStart w:id="1" w:name="_heading=h.axq4fv9fckil" w:colFirst="0" w:colLast="0"/>
-      <w:bookmarkEnd w:id="1"/>
+      <w:bookmarkStart w:id="1" w:name="_Toc238302679"/>
       <w:r>
         <w:t>Revision History</w:t>
       </w:r>
+      <w:bookmarkEnd w:id="1"/>
     </w:p>
     <w:p/>
     <w:tbl>
@@ -573,16 +594,110 @@
           </w:p>
         </w:tc>
       </w:tr>
+      <w:tr>
+        <w:tc>
+          <w:tcPr>
+            <w:tcW w:w="2304" w:type="dxa"/>
+          </w:tcPr>
+          <w:p>
+            <w:pPr>
+              <w:keepLines/>
+              <w:pBdr>
+                <w:top w:val="nil"/>
+                <w:left w:val="nil"/>
+                <w:bottom w:val="nil"/>
+                <w:right w:val="nil"/>
+                <w:between w:val="nil"/>
+              </w:pBdr>
+              <w:spacing w:after="120"/>
+            </w:pPr>
+            <w:r>
+              <w:t>2026-08-22</w:t>
+            </w:r>
+          </w:p>
+        </w:tc>
+        <w:tc>
+          <w:tcPr>
+            <w:tcW w:w="1152" w:type="dxa"/>
+          </w:tcPr>
+          <w:p>
+            <w:pPr>
+              <w:keepLines/>
+              <w:pBdr>
+                <w:top w:val="nil"/>
+                <w:left w:val="nil"/>
+                <w:bottom w:val="nil"/>
+                <w:right w:val="nil"/>
+                <w:between w:val="nil"/>
+              </w:pBdr>
+              <w:spacing w:after="120"/>
+            </w:pPr>
+            <w:r>
+              <w:t>1.3</w:t>
+            </w:r>
+          </w:p>
+        </w:tc>
+        <w:tc>
+          <w:tcPr>
+            <w:tcW w:w="3744" w:type="dxa"/>
+          </w:tcPr>
+          <w:p>
+            <w:pPr>
+              <w:keepLines/>
+              <w:pBdr>
+                <w:top w:val="nil"/>
+                <w:left w:val="nil"/>
+                <w:bottom w:val="nil"/>
+                <w:right w:val="nil"/>
+                <w:between w:val="nil"/>
+              </w:pBdr>
+              <w:spacing w:after="120"/>
+            </w:pPr>
+            <w:r>
+              <w:t xml:space="preserve">Added </w:t>
+            </w:r>
+            <w:proofErr w:type="spellStart"/>
+            <w:r>
+              <w:t>Wokwi</w:t>
+            </w:r>
+            <w:proofErr w:type="spellEnd"/>
+            <w:r>
+              <w:t xml:space="preserve"> simulation and Serial Monitor screenshots as test evidence.</w:t>
+            </w:r>
+          </w:p>
+        </w:tc>
+        <w:tc>
+          <w:tcPr>
+            <w:tcW w:w="2304" w:type="dxa"/>
+          </w:tcPr>
+          <w:p>
+            <w:pPr>
+              <w:keepLines/>
+              <w:pBdr>
+                <w:top w:val="nil"/>
+                <w:left w:val="nil"/>
+                <w:bottom w:val="nil"/>
+                <w:right w:val="nil"/>
+                <w:between w:val="nil"/>
+              </w:pBdr>
+              <w:spacing w:after="120"/>
+            </w:pPr>
+            <w:r>
+              <w:t>Ali Daoud</w:t>
+            </w:r>
+          </w:p>
+        </w:tc>
+      </w:tr>
     </w:tbl>
     <w:p>
       <w:pPr>
         <w:sectPr>
-          <w:headerReference w:type="even" r:id="rId8"/>
-          <w:headerReference w:type="default" r:id="rId9"/>
-          <w:footerReference w:type="even" r:id="rId10"/>
-          <w:footerReference w:type="default" r:id="rId11"/>
-          <w:headerReference w:type="first" r:id="rId12"/>
-          <w:footerReference w:type="first" r:id="rId13"/>
+          <w:headerReference w:type="even" r:id="rId9"/>
+          <w:headerReference w:type="default" r:id="rId10"/>
+          <w:footerReference w:type="even" r:id="rId11"/>
+          <w:footerReference w:type="default" r:id="rId12"/>
+          <w:headerReference w:type="first" r:id="rId13"/>
+          <w:footerReference w:type="first" r:id="rId14"/>
           <w:pgSz w:w="12240" w:h="15840"/>
           <w:pgMar w:top="1440" w:right="1440" w:bottom="1440" w:left="1440" w:header="720" w:footer="720" w:gutter="0"/>
           <w:pgNumType w:start="1"/>
@@ -615,102 +730,192 @@
     </w:p>
     <w:sdt>
       <w:sdtPr>
-        <w:id w:val="-1019379292"/>
+        <w:id w:val="2137903510"/>
         <w:docPartObj>
           <w:docPartGallery w:val="Table of Contents"/>
           <w:docPartUnique/>
         </w:docPartObj>
       </w:sdtPr>
+      <w:sdtEndPr>
+        <w:rPr>
+          <w:rFonts w:ascii="Times New Roman" w:eastAsia="Times New Roman" w:hAnsi="Times New Roman" w:cs="Times New Roman"/>
+          <w:b/>
+          <w:bCs/>
+          <w:color w:val="auto"/>
+          <w:sz w:val="20"/>
+          <w:szCs w:val="20"/>
+          <w:lang w:val="en"/>
+        </w:rPr>
+      </w:sdtEndPr>
       <w:sdtContent>
         <w:p>
           <w:pPr>
-            <w:pBdr>
-              <w:top w:val="nil"/>
-              <w:left w:val="nil"/>
-              <w:bottom w:val="nil"/>
-              <w:right w:val="nil"/>
-              <w:between w:val="nil"/>
-            </w:pBdr>
+            <w:pStyle w:val="Innehllsfrteckningsrubrik"/>
+          </w:pPr>
+        </w:p>
+        <w:p>
+          <w:pPr>
+            <w:pStyle w:val="Innehll1"/>
             <w:tabs>
-              <w:tab w:val="right" w:pos="9350"/>
+              <w:tab w:val="right" w:leader="dot" w:pos="9350"/>
             </w:tabs>
-            <w:spacing w:after="100"/>
             <w:rPr>
-              <w:color w:val="000000"/>
+              <w:rFonts w:asciiTheme="minorHAnsi" w:eastAsiaTheme="minorEastAsia" w:hAnsiTheme="minorHAnsi" w:cstheme="minorBidi"/>
+              <w:noProof/>
+              <w:kern w:val="2"/>
+              <w:sz w:val="24"/>
+              <w:szCs w:val="24"/>
+              <w:lang w:val="sv-SE"/>
+              <w14:ligatures w14:val="standardContextual"/>
             </w:rPr>
           </w:pPr>
           <w:r>
             <w:fldChar w:fldCharType="begin"/>
           </w:r>
           <w:r>
-            <w:instrText xml:space="preserve"> TOC \h \u \z \t "Heading 1,1,Heading 2,2,Heading 3,3,"</w:instrText>
+            <w:instrText xml:space="preserve"> TOC \o "1-3" \h \z \u </w:instrText>
           </w:r>
           <w:r>
             <w:fldChar w:fldCharType="separate"/>
           </w:r>
-          <w:hyperlink w:anchor="_heading=h.axq4fv9fckil">
-            <w:r>
-              <w:rPr>
-                <w:color w:val="000000"/>
-              </w:rPr>
-              <w:t>Revisio</w:t>
-            </w:r>
-            <w:r>
-              <w:rPr>
-                <w:color w:val="000000"/>
-              </w:rPr>
-              <w:t>n</w:t>
-            </w:r>
-            <w:r>
-              <w:rPr>
-                <w:color w:val="000000"/>
-              </w:rPr>
-              <w:t xml:space="preserve"> History</w:t>
-            </w:r>
-            <w:r>
-              <w:rPr>
-                <w:color w:val="000000"/>
+          <w:hyperlink w:anchor="_Toc238302679" w:history="1">
+            <w:r>
+              <w:rPr>
+                <w:rStyle w:val="Hyperlnk"/>
+                <w:noProof/>
+              </w:rPr>
+              <w:t>Revision History</w:t>
+            </w:r>
+            <w:r>
+              <w:rPr>
+                <w:noProof/>
+                <w:webHidden/>
               </w:rPr>
               <w:tab/>
+            </w:r>
+            <w:r>
+              <w:rPr>
+                <w:noProof/>
+                <w:webHidden/>
+              </w:rPr>
+              <w:fldChar w:fldCharType="begin"/>
+            </w:r>
+            <w:r>
+              <w:rPr>
+                <w:noProof/>
+                <w:webHidden/>
+              </w:rPr>
+              <w:instrText xml:space="preserve"> PAGEREF _Toc238302679 \h </w:instrText>
+            </w:r>
+            <w:r>
+              <w:rPr>
+                <w:noProof/>
+                <w:webHidden/>
+              </w:rPr>
+            </w:r>
+            <w:r>
+              <w:rPr>
+                <w:noProof/>
+                <w:webHidden/>
+              </w:rPr>
+              <w:fldChar w:fldCharType="separate"/>
+            </w:r>
+            <w:r>
+              <w:rPr>
+                <w:noProof/>
+                <w:webHidden/>
+              </w:rPr>
               <w:t>1</w:t>
+            </w:r>
+            <w:r>
+              <w:rPr>
+                <w:noProof/>
+                <w:webHidden/>
+              </w:rPr>
+              <w:fldChar w:fldCharType="end"/>
             </w:r>
           </w:hyperlink>
         </w:p>
         <w:p>
           <w:pPr>
-            <w:pBdr>
-              <w:top w:val="nil"/>
-              <w:left w:val="nil"/>
-              <w:bottom w:val="nil"/>
-              <w:right w:val="nil"/>
-              <w:between w:val="nil"/>
-            </w:pBdr>
+            <w:pStyle w:val="Innehll1"/>
             <w:tabs>
-              <w:tab w:val="right" w:pos="9350"/>
+              <w:tab w:val="right" w:leader="dot" w:pos="9350"/>
             </w:tabs>
-            <w:spacing w:after="100"/>
             <w:rPr>
-              <w:color w:val="000000"/>
+              <w:rFonts w:asciiTheme="minorHAnsi" w:eastAsiaTheme="minorEastAsia" w:hAnsiTheme="minorHAnsi" w:cstheme="minorBidi"/>
+              <w:noProof/>
+              <w:kern w:val="2"/>
+              <w:sz w:val="24"/>
+              <w:szCs w:val="24"/>
+              <w:lang w:val="sv-SE"/>
+              <w14:ligatures w14:val="standardContextual"/>
             </w:rPr>
           </w:pPr>
-          <w:hyperlink w:anchor="_heading=h.3yhpyjjsd91w">
-            <w:r>
-              <w:rPr>
-                <w:color w:val="000000"/>
+          <w:hyperlink w:anchor="_Toc238302680" w:history="1">
+            <w:r>
+              <w:rPr>
+                <w:rStyle w:val="Hyperlnk"/>
+                <w:noProof/>
               </w:rPr>
               <w:t>Test Plan</w:t>
             </w:r>
             <w:r>
               <w:rPr>
-                <w:color w:val="000000"/>
+                <w:noProof/>
+                <w:webHidden/>
               </w:rPr>
               <w:tab/>
+            </w:r>
+            <w:r>
+              <w:rPr>
+                <w:noProof/>
+                <w:webHidden/>
+              </w:rPr>
+              <w:fldChar w:fldCharType="begin"/>
+            </w:r>
+            <w:r>
+              <w:rPr>
+                <w:noProof/>
+                <w:webHidden/>
+              </w:rPr>
+              <w:instrText xml:space="preserve"> PAGEREF _Toc238302680 \h </w:instrText>
+            </w:r>
+            <w:r>
+              <w:rPr>
+                <w:noProof/>
+                <w:webHidden/>
+              </w:rPr>
+            </w:r>
+            <w:r>
+              <w:rPr>
+                <w:noProof/>
+                <w:webHidden/>
+              </w:rPr>
+              <w:fldChar w:fldCharType="separate"/>
+            </w:r>
+            <w:r>
+              <w:rPr>
+                <w:noProof/>
+                <w:webHidden/>
+              </w:rPr>
               <w:t>2</w:t>
+            </w:r>
+            <w:r>
+              <w:rPr>
+                <w:noProof/>
+                <w:webHidden/>
+              </w:rPr>
+              <w:fldChar w:fldCharType="end"/>
             </w:r>
           </w:hyperlink>
         </w:p>
         <w:p>
           <w:r>
+            <w:rPr>
+              <w:b/>
+              <w:bCs/>
+            </w:rPr>
             <w:fldChar w:fldCharType="end"/>
           </w:r>
         </w:p>
@@ -739,11 +944,11 @@
       <w:pPr>
         <w:pStyle w:val="Rubrik1"/>
       </w:pPr>
-      <w:bookmarkStart w:id="3" w:name="_heading=h.3yhpyjjsd91w" w:colFirst="0" w:colLast="0"/>
-      <w:bookmarkEnd w:id="3"/>
+      <w:bookmarkStart w:id="3" w:name="_Toc238302680"/>
       <w:r>
         <w:t>Test Plan</w:t>
       </w:r>
+      <w:bookmarkEnd w:id="3"/>
     </w:p>
     <w:p>
       <w:pPr>
@@ -1170,162 +1375,14 @@
           <w:p>
             <w:pPr>
               <w:rPr>
-                <w:lang w:val="sv-SE"/>
+                <w:lang w:val="en-US"/>
               </w:rPr>
             </w:pPr>
-            <w:proofErr w:type="spellStart"/>
-            <w:r>
-              <w:rPr>
-                <w:lang w:val="sv-SE"/>
-              </w:rPr>
-              <w:t>Retrieve</w:t>
-            </w:r>
-            <w:proofErr w:type="spellEnd"/>
-            <w:r>
-              <w:rPr>
-                <w:lang w:val="sv-SE"/>
-              </w:rPr>
-              <w:t xml:space="preserve"> </w:t>
-            </w:r>
-            <w:proofErr w:type="spellStart"/>
-            <w:r>
-              <w:rPr>
-                <w:lang w:val="sv-SE"/>
-              </w:rPr>
-              <w:t>simulated</w:t>
-            </w:r>
-            <w:proofErr w:type="spellEnd"/>
-            <w:r>
-              <w:rPr>
-                <w:lang w:val="sv-SE"/>
-              </w:rPr>
-              <w:t xml:space="preserve"> </w:t>
-            </w:r>
-            <w:proofErr w:type="spellStart"/>
-            <w:r>
-              <w:rPr>
-                <w:lang w:val="sv-SE"/>
-              </w:rPr>
-              <w:t>desired</w:t>
-            </w:r>
-            <w:proofErr w:type="spellEnd"/>
-            <w:r>
-              <w:rPr>
-                <w:lang w:val="sv-SE"/>
-              </w:rPr>
-              <w:t xml:space="preserve"> </w:t>
-            </w:r>
-            <w:proofErr w:type="spellStart"/>
-            <w:r>
-              <w:rPr>
-                <w:lang w:val="sv-SE"/>
-              </w:rPr>
-              <w:t>states</w:t>
-            </w:r>
-            <w:proofErr w:type="spellEnd"/>
-            <w:r>
-              <w:rPr>
-                <w:lang w:val="sv-SE"/>
-              </w:rPr>
-              <w:t xml:space="preserve"> and </w:t>
-            </w:r>
-            <w:proofErr w:type="spellStart"/>
-            <w:r>
-              <w:rPr>
-                <w:lang w:val="sv-SE"/>
-              </w:rPr>
-              <w:t>verify</w:t>
-            </w:r>
-            <w:proofErr w:type="spellEnd"/>
-            <w:r>
-              <w:rPr>
-                <w:lang w:val="sv-SE"/>
-              </w:rPr>
-              <w:t xml:space="preserve"> </w:t>
-            </w:r>
-            <w:proofErr w:type="spellStart"/>
-            <w:r>
-              <w:rPr>
-                <w:lang w:val="sv-SE"/>
-              </w:rPr>
-              <w:t>that</w:t>
-            </w:r>
-            <w:proofErr w:type="spellEnd"/>
-            <w:r>
-              <w:rPr>
-                <w:lang w:val="sv-SE"/>
-              </w:rPr>
-              <w:t xml:space="preserve"> the </w:t>
-            </w:r>
-            <w:proofErr w:type="spellStart"/>
-            <w:r>
-              <w:rPr>
-                <w:lang w:val="sv-SE"/>
-              </w:rPr>
-              <w:t>correct</w:t>
-            </w:r>
-            <w:proofErr w:type="spellEnd"/>
-            <w:r>
-              <w:rPr>
-                <w:lang w:val="sv-SE"/>
-              </w:rPr>
-              <w:t xml:space="preserve"> </w:t>
-            </w:r>
-            <w:proofErr w:type="spellStart"/>
-            <w:r>
-              <w:rPr>
-                <w:lang w:val="sv-SE"/>
-              </w:rPr>
-              <w:t>simulated</w:t>
-            </w:r>
-            <w:proofErr w:type="spellEnd"/>
-            <w:r>
-              <w:rPr>
-                <w:lang w:val="sv-SE"/>
-              </w:rPr>
-              <w:t xml:space="preserve"> </w:t>
-            </w:r>
-            <w:proofErr w:type="spellStart"/>
-            <w:r>
-              <w:rPr>
-                <w:lang w:val="sv-SE"/>
-              </w:rPr>
-              <w:t>devices</w:t>
-            </w:r>
-            <w:proofErr w:type="spellEnd"/>
-            <w:r>
-              <w:rPr>
-                <w:lang w:val="sv-SE"/>
-              </w:rPr>
-              <w:t xml:space="preserve"> </w:t>
-            </w:r>
-            <w:proofErr w:type="spellStart"/>
-            <w:r>
-              <w:rPr>
-                <w:lang w:val="sv-SE"/>
-              </w:rPr>
-              <w:t>change</w:t>
-            </w:r>
-            <w:proofErr w:type="spellEnd"/>
-            <w:r>
-              <w:rPr>
-                <w:lang w:val="sv-SE"/>
-              </w:rPr>
-              <w:t xml:space="preserve"> </w:t>
-            </w:r>
-            <w:proofErr w:type="spellStart"/>
-            <w:r>
-              <w:rPr>
-                <w:lang w:val="sv-SE"/>
-              </w:rPr>
-              <w:t>state</w:t>
-            </w:r>
-            <w:proofErr w:type="spellEnd"/>
-            <w:r>
-              <w:rPr>
-                <w:lang w:val="sv-SE"/>
-              </w:rPr>
-              <w:t>.</w:t>
+            <w:r>
+              <w:rPr>
+                <w:lang w:val="en-US"/>
+              </w:rPr>
+              <w:t>Retrieve simulated desired states and verify that the correct simulated devices change state.</w:t>
             </w:r>
           </w:p>
           <w:p/>
@@ -1358,6 +1415,7 @@
           </w:tcPr>
           <w:p>
             <w:r>
+              <w:lastRenderedPageBreak/>
               <w:t>R8. Device State Reporting</w:t>
             </w:r>
           </w:p>
@@ -1393,7 +1451,6 @@
           </w:tcPr>
           <w:p>
             <w:r>
-              <w:lastRenderedPageBreak/>
               <w:t>R9. Multiple Device Support</w:t>
             </w:r>
           </w:p>
@@ -1432,12 +1489,202 @@
       </w:pPr>
       <w:bookmarkStart w:id="4" w:name="_heading=h.amvd2eibz6oj" w:colFirst="0" w:colLast="0"/>
       <w:bookmarkEnd w:id="4"/>
+      <w:r>
+        <w:rPr>
+          <w:i/>
+          <w:iCs/>
+          <w:noProof/>
+        </w:rPr>
+        <w:drawing>
+          <wp:inline distT="0" distB="0" distL="0" distR="0" wp14:anchorId="1ABED9B6" wp14:editId="015C7E1A">
+            <wp:extent cx="5943600" cy="3031490"/>
+            <wp:effectExtent l="0" t="0" r="0" b="0"/>
+            <wp:docPr id="1915872036" name="Bildobjekt 1"/>
+            <wp:cNvGraphicFramePr>
+              <a:graphicFrameLocks xmlns:a="http://schemas.openxmlformats.org/drawingml/2006/main" noChangeAspect="1"/>
+            </wp:cNvGraphicFramePr>
+            <a:graphic xmlns:a="http://schemas.openxmlformats.org/drawingml/2006/main">
+              <a:graphicData uri="http://schemas.openxmlformats.org/drawingml/2006/picture">
+                <pic:pic xmlns:pic="http://schemas.openxmlformats.org/drawingml/2006/picture">
+                  <pic:nvPicPr>
+                    <pic:cNvPr id="1915872036" name=""/>
+                    <pic:cNvPicPr/>
+                  </pic:nvPicPr>
+                  <pic:blipFill>
+                    <a:blip r:embed="rId15"/>
+                    <a:stretch>
+                      <a:fillRect/>
+                    </a:stretch>
+                  </pic:blipFill>
+                  <pic:spPr>
+                    <a:xfrm>
+                      <a:off x="0" y="0"/>
+                      <a:ext cx="5943600" cy="3031490"/>
+                    </a:xfrm>
+                    <a:prstGeom prst="rect">
+                      <a:avLst/>
+                    </a:prstGeom>
+                  </pic:spPr>
+                </pic:pic>
+              </a:graphicData>
+            </a:graphic>
+          </wp:inline>
+        </w:drawing>
+      </w:r>
+    </w:p>
+    <w:p>
+      <w:pPr>
+        <w:rPr>
+          <w:i/>
+          <w:iCs/>
+        </w:rPr>
+      </w:pPr>
+      <w:r>
+        <w:rPr>
+          <w:i/>
+          <w:iCs/>
+        </w:rPr>
+        <w:t xml:space="preserve">Figure 1. </w:t>
+      </w:r>
+      <w:proofErr w:type="spellStart"/>
+      <w:r>
+        <w:rPr>
+          <w:i/>
+          <w:iCs/>
+        </w:rPr>
+        <w:t>Wokwi</w:t>
+      </w:r>
+      <w:proofErr w:type="spellEnd"/>
+      <w:r>
+        <w:rPr>
+          <w:i/>
+          <w:iCs/>
+        </w:rPr>
+        <w:t xml:space="preserve"> simulation </w:t>
+      </w:r>
+      <w:proofErr w:type="gramStart"/>
+      <w:r>
+        <w:rPr>
+          <w:i/>
+          <w:iCs/>
+        </w:rPr>
+        <w:t>showing</w:t>
+      </w:r>
+      <w:proofErr w:type="gramEnd"/>
+      <w:r>
+        <w:rPr>
+          <w:i/>
+          <w:iCs/>
+        </w:rPr>
+        <w:t xml:space="preserve"> the ESP32 and connected </w:t>
+      </w:r>
+      <w:proofErr w:type="spellStart"/>
+      <w:r>
+        <w:rPr>
+          <w:i/>
+          <w:iCs/>
+        </w:rPr>
+        <w:t>SmartHouse</w:t>
+      </w:r>
+      <w:proofErr w:type="spellEnd"/>
+      <w:r>
+        <w:rPr>
+          <w:i/>
+          <w:iCs/>
+        </w:rPr>
+        <w:t xml:space="preserve"> devices.</w:t>
+      </w:r>
+    </w:p>
+    <w:p>
+      <w:pPr>
+        <w:rPr>
+          <w:i/>
+          <w:iCs/>
+        </w:rPr>
+      </w:pPr>
+    </w:p>
+    <w:p>
+      <w:pPr>
+        <w:rPr>
+          <w:i/>
+          <w:iCs/>
+        </w:rPr>
+      </w:pPr>
+      <w:r>
+        <w:rPr>
+          <w:i/>
+          <w:iCs/>
+          <w:noProof/>
+        </w:rPr>
+        <w:lastRenderedPageBreak/>
+        <w:drawing>
+          <wp:inline distT="0" distB="0" distL="0" distR="0" wp14:anchorId="44DAB370" wp14:editId="258F5811">
+            <wp:extent cx="5943600" cy="3388360"/>
+            <wp:effectExtent l="0" t="0" r="0" b="2540"/>
+            <wp:docPr id="746805041" name="Bildobjekt 1"/>
+            <wp:cNvGraphicFramePr>
+              <a:graphicFrameLocks xmlns:a="http://schemas.openxmlformats.org/drawingml/2006/main" noChangeAspect="1"/>
+            </wp:cNvGraphicFramePr>
+            <a:graphic xmlns:a="http://schemas.openxmlformats.org/drawingml/2006/main">
+              <a:graphicData uri="http://schemas.openxmlformats.org/drawingml/2006/picture">
+                <pic:pic xmlns:pic="http://schemas.openxmlformats.org/drawingml/2006/picture">
+                  <pic:nvPicPr>
+                    <pic:cNvPr id="746805041" name=""/>
+                    <pic:cNvPicPr/>
+                  </pic:nvPicPr>
+                  <pic:blipFill>
+                    <a:blip r:embed="rId16"/>
+                    <a:stretch>
+                      <a:fillRect/>
+                    </a:stretch>
+                  </pic:blipFill>
+                  <pic:spPr>
+                    <a:xfrm>
+                      <a:off x="0" y="0"/>
+                      <a:ext cx="5943600" cy="3388360"/>
+                    </a:xfrm>
+                    <a:prstGeom prst="rect">
+                      <a:avLst/>
+                    </a:prstGeom>
+                  </pic:spPr>
+                </pic:pic>
+              </a:graphicData>
+            </a:graphic>
+          </wp:inline>
+        </w:drawing>
+      </w:r>
+    </w:p>
+    <w:p>
+      <w:pPr>
+        <w:rPr>
+          <w:i/>
+          <w:iCs/>
+          <w:lang w:val="en-US"/>
+        </w:rPr>
+      </w:pPr>
+      <w:r>
+        <w:rPr>
+          <w:i/>
+          <w:iCs/>
+          <w:lang w:val="en-US"/>
+        </w:rPr>
+        <w:t>Figure 2. Serial Monitor showing successful mock device registration and stored device secrets.</w:t>
+      </w:r>
+    </w:p>
+    <w:p>
+      <w:pPr>
+        <w:rPr>
+          <w:i/>
+          <w:iCs/>
+          <w:lang w:val="en-US"/>
+        </w:rPr>
+      </w:pPr>
     </w:p>
     <w:sectPr>
-      <w:headerReference w:type="default" r:id="rId14"/>
-      <w:footerReference w:type="default" r:id="rId15"/>
-      <w:headerReference w:type="first" r:id="rId16"/>
-      <w:footerReference w:type="first" r:id="rId17"/>
+      <w:headerReference w:type="default" r:id="rId17"/>
+      <w:footerReference w:type="default" r:id="rId18"/>
+      <w:headerReference w:type="first" r:id="rId19"/>
+      <w:footerReference w:type="first" r:id="rId20"/>
       <w:pgSz w:w="12240" w:h="15840"/>
       <w:pgMar w:top="1440" w:right="1440" w:bottom="1440" w:left="1440" w:header="720" w:footer="720" w:gutter="0"/>
       <w:cols w:space="720"/>
@@ -1447,7 +1694,7 @@
 </file>
 
 <file path=word/endnotes.xml><?xml version="1.0" encoding="utf-8"?>
-<w:endnotes xmlns:wpc="http://schemas.microsoft.com/office/word/2010/wordprocessingCanvas" xmlns:cx="http://schemas.microsoft.com/office/drawing/2014/chartex" xmlns:cx1="http://schemas.microsoft.com/office/drawing/2015/9/8/chartex" xmlns:cx2="http://schemas.microsoft.com/office/drawing/2015/10/21/chartex" xmlns:cx3="http://schemas.microsoft.com/office/drawing/2016/5/9/chartex" xmlns:cx4="http://schemas.microsoft.com/office/drawing/2016/5/10/chartex" xmlns:cx5="http://schemas.microsoft.com/office/drawing/2016/5/11/chartex" xmlns:cx6="http://schemas.microsoft.com/office/drawing/2016/5/12/chartex" xmlns:cx7="http://schemas.microsoft.com/office/drawing/2016/5/13/chartex" xmlns:cx8="http://schemas.microsoft.com/office/drawing/2016/5/14/chartex" xmlns:mc="http://schemas.openxmlformats.org/markup-compatibility/2006" xmlns:aink="http://schemas.microsoft.com/office/drawing/2016/ink" xmlns:am3d="http://schemas.microsoft.com/office/drawing/2017/model3d" xmlns:o="urn:schemas-microsoft-com:office:office" xmlns:oel="http://schemas.microsoft.com/office/2019/extlst" xmlns:r="http://schemas.openxmlformats.org/officeDocument/2006/relationships" xmlns:m="http://schemas.openxmlformats.org/officeDocument/2006/math" xmlns:v="urn:schemas-microsoft-com:vml" xmlns:wp14="http://schemas.microsoft.com/office/word/2010/wordprocessingDrawing" xmlns:wp="http://schemas.openxmlformats.org/drawingml/2006/wordprocessingDrawing" xmlns:w10="urn:schemas-microsoft-com:office:word" xmlns:w="http://schemas.openxmlformats.org/wordprocessingml/2006/main" xmlns:w14="http://schemas.microsoft.com/office/word/2010/wordml" xmlns:w15="http://schemas.microsoft.com/office/word/2012/wordml" xmlns:w16cei="http://schemas.microsoft.com/office/word/2026/wordml/cei" xmlns:w16cex="http://schemas.microsoft.com/office/word/2018/wordml/cex" xmlns:w16cid="http://schemas.microsoft.com/office/word/2016/wordml/cid" xmlns:w16="http://schemas.microsoft.com/office/word/2018/wordml" xmlns:w16du="http://schemas.microsoft.com/office/word/2023/wordml/word16du" xmlns:w16sdtdh="http://schemas.microsoft.com/office/word/2020/wordml/sdtdatahash" xmlns:w16sdtfl="http://schemas.microsoft.com/office/word/2024/wordml/sdtformatlock" xmlns:w16se="http://schemas.microsoft.com/office/word/2015/wordml/symex" xmlns:wpg="http://schemas.microsoft.com/office/word/2010/wordprocessingGroup" xmlns:wpi="http://schemas.microsoft.com/office/word/2010/wordprocessingInk" xmlns:wne="http://schemas.microsoft.com/office/word/2006/wordml" xmlns:wps="http://schemas.microsoft.com/office/word/2010/wordprocessingShape" mc:Ignorable="w14 w15 w16se w16cid w16 w16cex w16sdtdh w16sdtfl w16du wp14">
+<w:endnotes xmlns:wpc="http://schemas.microsoft.com/office/word/2010/wordprocessingCanvas" xmlns:cx="http://schemas.microsoft.com/office/drawing/2014/chartex" xmlns:cx1="http://schemas.microsoft.com/office/drawing/2015/9/8/chartex" xmlns:cx2="http://schemas.microsoft.com/office/drawing/2015/10/21/chartex" xmlns:cx3="http://schemas.microsoft.com/office/drawing/2016/5/9/chartex" xmlns:cx4="http://schemas.microsoft.com/office/drawing/2016/5/10/chartex" xmlns:cx5="http://schemas.microsoft.com/office/drawing/2016/5/11/chartex" xmlns:cx6="http://schemas.microsoft.com/office/drawing/2016/5/12/chartex" xmlns:cx7="http://schemas.microsoft.com/office/drawing/2016/5/13/chartex" xmlns:cx8="http://schemas.microsoft.com/office/drawing/2016/5/14/chartex" xmlns:mc="http://schemas.openxmlformats.org/markup-compatibility/2006" xmlns:aink="http://schemas.microsoft.com/office/drawing/2016/ink" xmlns:am3d="http://schemas.microsoft.com/office/drawing/2017/model3d" xmlns:o="urn:schemas-microsoft-com:office:office" xmlns:oel="http://schemas.microsoft.com/office/2019/extlst" xmlns:r="http://schemas.openxmlformats.org/officeDocument/2006/relationships" xmlns:m="http://schemas.openxmlformats.org/officeDocument/2006/math" xmlns:v="urn:schemas-microsoft-com:vml" xmlns:wp14="http://schemas.microsoft.com/office/word/2010/wordprocessingDrawing" xmlns:wp="http://schemas.openxmlformats.org/drawingml/2006/wordprocessingDrawing" xmlns:w10="urn:schemas-microsoft-com:office:word" xmlns:w="http://schemas.openxmlformats.org/wordprocessingml/2006/main" xmlns:w14="http://schemas.microsoft.com/office/word/2010/wordml" xmlns:w15="http://schemas.microsoft.com/office/word/2012/wordml" xmlns:w16cex="http://schemas.microsoft.com/office/word/2018/wordml/cex" xmlns:w16cid="http://schemas.microsoft.com/office/word/2016/wordml/cid" xmlns:w16="http://schemas.microsoft.com/office/word/2018/wordml" xmlns:w16du="http://schemas.microsoft.com/office/word/2023/wordml/word16du" xmlns:w16sdtdh="http://schemas.microsoft.com/office/word/2020/wordml/sdtdatahash" xmlns:w16sdtfl="http://schemas.microsoft.com/office/word/2024/wordml/sdtformatlock" xmlns:w16se="http://schemas.microsoft.com/office/word/2015/wordml/symex" xmlns:wpg="http://schemas.microsoft.com/office/word/2010/wordprocessingGroup" xmlns:wpi="http://schemas.microsoft.com/office/word/2010/wordprocessingInk" xmlns:wne="http://schemas.microsoft.com/office/word/2006/wordml" xmlns:wps="http://schemas.microsoft.com/office/word/2010/wordprocessingShape" mc:Ignorable="w14 w15 w16se w16cid w16 w16cex w16sdtdh w16sdtfl w16du wp14">
   <w:endnote w:type="separator" w:id="-1">
     <w:p>
       <w:r>
@@ -1466,7 +1713,7 @@
 </file>
 
 <file path=word/footer1.xml><?xml version="1.0" encoding="utf-8"?>
-<w:ftr xmlns:wpc="http://schemas.microsoft.com/office/word/2010/wordprocessingCanvas" xmlns:cx="http://schemas.microsoft.com/office/drawing/2014/chartex" xmlns:cx1="http://schemas.microsoft.com/office/drawing/2015/9/8/chartex" xmlns:cx2="http://schemas.microsoft.com/office/drawing/2015/10/21/chartex" xmlns:cx3="http://schemas.microsoft.com/office/drawing/2016/5/9/chartex" xmlns:cx4="http://schemas.microsoft.com/office/drawing/2016/5/10/chartex" xmlns:cx5="http://schemas.microsoft.com/office/drawing/2016/5/11/chartex" xmlns:cx6="http://schemas.microsoft.com/office/drawing/2016/5/12/chartex" xmlns:cx7="http://schemas.microsoft.com/office/drawing/2016/5/13/chartex" xmlns:cx8="http://schemas.microsoft.com/office/drawing/2016/5/14/chartex" xmlns:mc="http://schemas.openxmlformats.org/markup-compatibility/2006" xmlns:aink="http://schemas.microsoft.com/office/drawing/2016/ink" xmlns:am3d="http://schemas.microsoft.com/office/drawing/2017/model3d" xmlns:o="urn:schemas-microsoft-com:office:office" xmlns:oel="http://schemas.microsoft.com/office/2019/extlst" xmlns:r="http://schemas.openxmlformats.org/officeDocument/2006/relationships" xmlns:m="http://schemas.openxmlformats.org/officeDocument/2006/math" xmlns:v="urn:schemas-microsoft-com:vml" xmlns:wp14="http://schemas.microsoft.com/office/word/2010/wordprocessingDrawing" xmlns:wp="http://schemas.openxmlformats.org/drawingml/2006/wordprocessingDrawing" xmlns:w10="urn:schemas-microsoft-com:office:word" xmlns:w="http://schemas.openxmlformats.org/wordprocessingml/2006/main" xmlns:w14="http://schemas.microsoft.com/office/word/2010/wordml" xmlns:w15="http://schemas.microsoft.com/office/word/2012/wordml" xmlns:w16cei="http://schemas.microsoft.com/office/word/2026/wordml/cei" xmlns:w16cex="http://schemas.microsoft.com/office/word/2018/wordml/cex" xmlns:w16cid="http://schemas.microsoft.com/office/word/2016/wordml/cid" xmlns:w16="http://schemas.microsoft.com/office/word/2018/wordml" xmlns:w16du="http://schemas.microsoft.com/office/word/2023/wordml/word16du" xmlns:w16sdtdh="http://schemas.microsoft.com/office/word/2020/wordml/sdtdatahash" xmlns:w16sdtfl="http://schemas.microsoft.com/office/word/2024/wordml/sdtformatlock" xmlns:w16se="http://schemas.microsoft.com/office/word/2015/wordml/symex" xmlns:wpg="http://schemas.microsoft.com/office/word/2010/wordprocessingGroup" xmlns:wpi="http://schemas.microsoft.com/office/word/2010/wordprocessingInk" xmlns:wne="http://schemas.microsoft.com/office/word/2006/wordml" xmlns:wps="http://schemas.microsoft.com/office/word/2010/wordprocessingShape" mc:Ignorable="w14 w15 w16se w16cid w16 w16cex w16sdtdh w16sdtfl w16du wp14">
+<w:ftr xmlns:wpc="http://schemas.microsoft.com/office/word/2010/wordprocessingCanvas" xmlns:cx="http://schemas.microsoft.com/office/drawing/2014/chartex" xmlns:cx1="http://schemas.microsoft.com/office/drawing/2015/9/8/chartex" xmlns:cx2="http://schemas.microsoft.com/office/drawing/2015/10/21/chartex" xmlns:cx3="http://schemas.microsoft.com/office/drawing/2016/5/9/chartex" xmlns:cx4="http://schemas.microsoft.com/office/drawing/2016/5/10/chartex" xmlns:cx5="http://schemas.microsoft.com/office/drawing/2016/5/11/chartex" xmlns:cx6="http://schemas.microsoft.com/office/drawing/2016/5/12/chartex" xmlns:cx7="http://schemas.microsoft.com/office/drawing/2016/5/13/chartex" xmlns:cx8="http://schemas.microsoft.com/office/drawing/2016/5/14/chartex" xmlns:mc="http://schemas.openxmlformats.org/markup-compatibility/2006" xmlns:aink="http://schemas.microsoft.com/office/drawing/2016/ink" xmlns:am3d="http://schemas.microsoft.com/office/drawing/2017/model3d" xmlns:o="urn:schemas-microsoft-com:office:office" xmlns:oel="http://schemas.microsoft.com/office/2019/extlst" xmlns:r="http://schemas.openxmlformats.org/officeDocument/2006/relationships" xmlns:m="http://schemas.openxmlformats.org/officeDocument/2006/math" xmlns:v="urn:schemas-microsoft-com:vml" xmlns:wp14="http://schemas.microsoft.com/office/word/2010/wordprocessingDrawing" xmlns:wp="http://schemas.openxmlformats.org/drawingml/2006/wordprocessingDrawing" xmlns:w10="urn:schemas-microsoft-com:office:word" xmlns:w="http://schemas.openxmlformats.org/wordprocessingml/2006/main" xmlns:w14="http://schemas.microsoft.com/office/word/2010/wordml" xmlns:w15="http://schemas.microsoft.com/office/word/2012/wordml" xmlns:w16cex="http://schemas.microsoft.com/office/word/2018/wordml/cex" xmlns:w16cid="http://schemas.microsoft.com/office/word/2016/wordml/cid" xmlns:w16="http://schemas.microsoft.com/office/word/2018/wordml" xmlns:w16du="http://schemas.microsoft.com/office/word/2023/wordml/word16du" xmlns:w16sdtdh="http://schemas.microsoft.com/office/word/2020/wordml/sdtdatahash" xmlns:w16sdtfl="http://schemas.microsoft.com/office/word/2024/wordml/sdtformatlock" xmlns:w16se="http://schemas.microsoft.com/office/word/2015/wordml/symex" xmlns:wpg="http://schemas.microsoft.com/office/word/2010/wordprocessingGroup" xmlns:wpi="http://schemas.microsoft.com/office/word/2010/wordprocessingInk" xmlns:wne="http://schemas.microsoft.com/office/word/2006/wordml" xmlns:wps="http://schemas.microsoft.com/office/word/2010/wordprocessingShape" mc:Ignorable="w14 w15 w16se w16cid w16 w16cex w16sdtdh w16sdtfl w16du wp14">
   <w:p>
     <w:pPr>
       <w:pBdr>
@@ -1533,7 +1780,7 @@
 </file>
 
 <file path=word/footer2.xml><?xml version="1.0" encoding="utf-8"?>
-<w:ftr xmlns:wpc="http://schemas.microsoft.com/office/word/2010/wordprocessingCanvas" xmlns:cx="http://schemas.microsoft.com/office/drawing/2014/chartex" xmlns:cx1="http://schemas.microsoft.com/office/drawing/2015/9/8/chartex" xmlns:cx2="http://schemas.microsoft.com/office/drawing/2015/10/21/chartex" xmlns:cx3="http://schemas.microsoft.com/office/drawing/2016/5/9/chartex" xmlns:cx4="http://schemas.microsoft.com/office/drawing/2016/5/10/chartex" xmlns:cx5="http://schemas.microsoft.com/office/drawing/2016/5/11/chartex" xmlns:cx6="http://schemas.microsoft.com/office/drawing/2016/5/12/chartex" xmlns:cx7="http://schemas.microsoft.com/office/drawing/2016/5/13/chartex" xmlns:cx8="http://schemas.microsoft.com/office/drawing/2016/5/14/chartex" xmlns:mc="http://schemas.openxmlformats.org/markup-compatibility/2006" xmlns:aink="http://schemas.microsoft.com/office/drawing/2016/ink" xmlns:am3d="http://schemas.microsoft.com/office/drawing/2017/model3d" xmlns:o="urn:schemas-microsoft-com:office:office" xmlns:oel="http://schemas.microsoft.com/office/2019/extlst" xmlns:r="http://schemas.openxmlformats.org/officeDocument/2006/relationships" xmlns:m="http://schemas.openxmlformats.org/officeDocument/2006/math" xmlns:v="urn:schemas-microsoft-com:vml" xmlns:wp14="http://schemas.microsoft.com/office/word/2010/wordprocessingDrawing" xmlns:wp="http://schemas.openxmlformats.org/drawingml/2006/wordprocessingDrawing" xmlns:w10="urn:schemas-microsoft-com:office:word" xmlns:w="http://schemas.openxmlformats.org/wordprocessingml/2006/main" xmlns:w14="http://schemas.microsoft.com/office/word/2010/wordml" xmlns:w15="http://schemas.microsoft.com/office/word/2012/wordml" xmlns:w16cei="http://schemas.microsoft.com/office/word/2026/wordml/cei" xmlns:w16cex="http://schemas.microsoft.com/office/word/2018/wordml/cex" xmlns:w16cid="http://schemas.microsoft.com/office/word/2016/wordml/cid" xmlns:w16="http://schemas.microsoft.com/office/word/2018/wordml" xmlns:w16du="http://schemas.microsoft.com/office/word/2023/wordml/word16du" xmlns:w16sdtdh="http://schemas.microsoft.com/office/word/2020/wordml/sdtdatahash" xmlns:w16sdtfl="http://schemas.microsoft.com/office/word/2024/wordml/sdtformatlock" xmlns:w16se="http://schemas.microsoft.com/office/word/2015/wordml/symex" xmlns:wpg="http://schemas.microsoft.com/office/word/2010/wordprocessingGroup" xmlns:wpi="http://schemas.microsoft.com/office/word/2010/wordprocessingInk" xmlns:wne="http://schemas.microsoft.com/office/word/2006/wordml" xmlns:wps="http://schemas.microsoft.com/office/word/2010/wordprocessingShape" mc:Ignorable="w14 w15 w16se w16cid w16 w16cex w16sdtdh w16sdtfl w16du wp14">
+<w:ftr xmlns:wpc="http://schemas.microsoft.com/office/word/2010/wordprocessingCanvas" xmlns:cx="http://schemas.microsoft.com/office/drawing/2014/chartex" xmlns:cx1="http://schemas.microsoft.com/office/drawing/2015/9/8/chartex" xmlns:cx2="http://schemas.microsoft.com/office/drawing/2015/10/21/chartex" xmlns:cx3="http://schemas.microsoft.com/office/drawing/2016/5/9/chartex" xmlns:cx4="http://schemas.microsoft.com/office/drawing/2016/5/10/chartex" xmlns:cx5="http://schemas.microsoft.com/office/drawing/2016/5/11/chartex" xmlns:cx6="http://schemas.microsoft.com/office/drawing/2016/5/12/chartex" xmlns:cx7="http://schemas.microsoft.com/office/drawing/2016/5/13/chartex" xmlns:cx8="http://schemas.microsoft.com/office/drawing/2016/5/14/chartex" xmlns:mc="http://schemas.openxmlformats.org/markup-compatibility/2006" xmlns:aink="http://schemas.microsoft.com/office/drawing/2016/ink" xmlns:am3d="http://schemas.microsoft.com/office/drawing/2017/model3d" xmlns:o="urn:schemas-microsoft-com:office:office" xmlns:oel="http://schemas.microsoft.com/office/2019/extlst" xmlns:r="http://schemas.openxmlformats.org/officeDocument/2006/relationships" xmlns:m="http://schemas.openxmlformats.org/officeDocument/2006/math" xmlns:v="urn:schemas-microsoft-com:vml" xmlns:wp14="http://schemas.microsoft.com/office/word/2010/wordprocessingDrawing" xmlns:wp="http://schemas.openxmlformats.org/drawingml/2006/wordprocessingDrawing" xmlns:w10="urn:schemas-microsoft-com:office:word" xmlns:w="http://schemas.openxmlformats.org/wordprocessingml/2006/main" xmlns:w14="http://schemas.microsoft.com/office/word/2010/wordml" xmlns:w15="http://schemas.microsoft.com/office/word/2012/wordml" xmlns:w16cex="http://schemas.microsoft.com/office/word/2018/wordml/cex" xmlns:w16cid="http://schemas.microsoft.com/office/word/2016/wordml/cid" xmlns:w16="http://schemas.microsoft.com/office/word/2018/wordml" xmlns:w16du="http://schemas.microsoft.com/office/word/2023/wordml/word16du" xmlns:w16sdtdh="http://schemas.microsoft.com/office/word/2020/wordml/sdtdatahash" xmlns:w16sdtfl="http://schemas.microsoft.com/office/word/2024/wordml/sdtformatlock" xmlns:w16se="http://schemas.microsoft.com/office/word/2015/wordml/symex" xmlns:wpg="http://schemas.microsoft.com/office/word/2010/wordprocessingGroup" xmlns:wpi="http://schemas.microsoft.com/office/word/2010/wordprocessingInk" xmlns:wne="http://schemas.microsoft.com/office/word/2006/wordml" xmlns:wps="http://schemas.microsoft.com/office/word/2010/wordprocessingShape" mc:Ignorable="w14 w15 w16se w16cid w16 w16cex w16sdtdh w16sdtfl w16du wp14">
   <w:p>
     <w:pPr>
       <w:pBdr>
@@ -1556,7 +1803,7 @@
 </file>
 
 <file path=word/footer3.xml><?xml version="1.0" encoding="utf-8"?>
-<w:ftr xmlns:wpc="http://schemas.microsoft.com/office/word/2010/wordprocessingCanvas" xmlns:cx="http://schemas.microsoft.com/office/drawing/2014/chartex" xmlns:cx1="http://schemas.microsoft.com/office/drawing/2015/9/8/chartex" xmlns:cx2="http://schemas.microsoft.com/office/drawing/2015/10/21/chartex" xmlns:cx3="http://schemas.microsoft.com/office/drawing/2016/5/9/chartex" xmlns:cx4="http://schemas.microsoft.com/office/drawing/2016/5/10/chartex" xmlns:cx5="http://schemas.microsoft.com/office/drawing/2016/5/11/chartex" xmlns:cx6="http://schemas.microsoft.com/office/drawing/2016/5/12/chartex" xmlns:cx7="http://schemas.microsoft.com/office/drawing/2016/5/13/chartex" xmlns:cx8="http://schemas.microsoft.com/office/drawing/2016/5/14/chartex" xmlns:mc="http://schemas.openxmlformats.org/markup-compatibility/2006" xmlns:aink="http://schemas.microsoft.com/office/drawing/2016/ink" xmlns:am3d="http://schemas.microsoft.com/office/drawing/2017/model3d" xmlns:o="urn:schemas-microsoft-com:office:office" xmlns:oel="http://schemas.microsoft.com/office/2019/extlst" xmlns:r="http://schemas.openxmlformats.org/officeDocument/2006/relationships" xmlns:m="http://schemas.openxmlformats.org/officeDocument/2006/math" xmlns:v="urn:schemas-microsoft-com:vml" xmlns:wp14="http://schemas.microsoft.com/office/word/2010/wordprocessingDrawing" xmlns:wp="http://schemas.openxmlformats.org/drawingml/2006/wordprocessingDrawing" xmlns:w10="urn:schemas-microsoft-com:office:word" xmlns:w="http://schemas.openxmlformats.org/wordprocessingml/2006/main" xmlns:w14="http://schemas.microsoft.com/office/word/2010/wordml" xmlns:w15="http://schemas.microsoft.com/office/word/2012/wordml" xmlns:w16cei="http://schemas.microsoft.com/office/word/2026/wordml/cei" xmlns:w16cex="http://schemas.microsoft.com/office/word/2018/wordml/cex" xmlns:w16cid="http://schemas.microsoft.com/office/word/2016/wordml/cid" xmlns:w16="http://schemas.microsoft.com/office/word/2018/wordml" xmlns:w16du="http://schemas.microsoft.com/office/word/2023/wordml/word16du" xmlns:w16sdtdh="http://schemas.microsoft.com/office/word/2020/wordml/sdtdatahash" xmlns:w16sdtfl="http://schemas.microsoft.com/office/word/2024/wordml/sdtformatlock" xmlns:w16se="http://schemas.microsoft.com/office/word/2015/wordml/symex" xmlns:wpg="http://schemas.microsoft.com/office/word/2010/wordprocessingGroup" xmlns:wpi="http://schemas.microsoft.com/office/word/2010/wordprocessingInk" xmlns:wne="http://schemas.microsoft.com/office/word/2006/wordml" xmlns:wps="http://schemas.microsoft.com/office/word/2010/wordprocessingShape" mc:Ignorable="w14 w15 w16se w16cid w16 w16cex w16sdtdh w16sdtfl w16du wp14">
+<w:ftr xmlns:wpc="http://schemas.microsoft.com/office/word/2010/wordprocessingCanvas" xmlns:cx="http://schemas.microsoft.com/office/drawing/2014/chartex" xmlns:cx1="http://schemas.microsoft.com/office/drawing/2015/9/8/chartex" xmlns:cx2="http://schemas.microsoft.com/office/drawing/2015/10/21/chartex" xmlns:cx3="http://schemas.microsoft.com/office/drawing/2016/5/9/chartex" xmlns:cx4="http://schemas.microsoft.com/office/drawing/2016/5/10/chartex" xmlns:cx5="http://schemas.microsoft.com/office/drawing/2016/5/11/chartex" xmlns:cx6="http://schemas.microsoft.com/office/drawing/2016/5/12/chartex" xmlns:cx7="http://schemas.microsoft.com/office/drawing/2016/5/13/chartex" xmlns:cx8="http://schemas.microsoft.com/office/drawing/2016/5/14/chartex" xmlns:mc="http://schemas.openxmlformats.org/markup-compatibility/2006" xmlns:aink="http://schemas.microsoft.com/office/drawing/2016/ink" xmlns:am3d="http://schemas.microsoft.com/office/drawing/2017/model3d" xmlns:o="urn:schemas-microsoft-com:office:office" xmlns:oel="http://schemas.microsoft.com/office/2019/extlst" xmlns:r="http://schemas.openxmlformats.org/officeDocument/2006/relationships" xmlns:m="http://schemas.openxmlformats.org/officeDocument/2006/math" xmlns:v="urn:schemas-microsoft-com:vml" xmlns:wp14="http://schemas.microsoft.com/office/word/2010/wordprocessingDrawing" xmlns:wp="http://schemas.openxmlformats.org/drawingml/2006/wordprocessingDrawing" xmlns:w10="urn:schemas-microsoft-com:office:word" xmlns:w="http://schemas.openxmlformats.org/wordprocessingml/2006/main" xmlns:w14="http://schemas.microsoft.com/office/word/2010/wordml" xmlns:w15="http://schemas.microsoft.com/office/word/2012/wordml" xmlns:w16cex="http://schemas.microsoft.com/office/word/2018/wordml/cex" xmlns:w16cid="http://schemas.microsoft.com/office/word/2016/wordml/cid" xmlns:w16="http://schemas.microsoft.com/office/word/2018/wordml" xmlns:w16du="http://schemas.microsoft.com/office/word/2023/wordml/word16du" xmlns:w16sdtdh="http://schemas.microsoft.com/office/word/2020/wordml/sdtdatahash" xmlns:w16sdtfl="http://schemas.microsoft.com/office/word/2024/wordml/sdtformatlock" xmlns:w16se="http://schemas.microsoft.com/office/word/2015/wordml/symex" xmlns:wpg="http://schemas.microsoft.com/office/word/2010/wordprocessingGroup" xmlns:wpi="http://schemas.microsoft.com/office/word/2010/wordprocessingInk" xmlns:wne="http://schemas.microsoft.com/office/word/2006/wordml" xmlns:wps="http://schemas.microsoft.com/office/word/2010/wordprocessingShape" mc:Ignorable="w14 w15 w16se w16cid w16 w16cex w16sdtdh w16sdtfl w16du wp14">
   <w:p>
     <w:pPr>
       <w:pBdr>
@@ -1579,7 +1826,7 @@
 </file>
 
 <file path=word/footer4.xml><?xml version="1.0" encoding="utf-8"?>
-<w:ftr xmlns:wpc="http://schemas.microsoft.com/office/word/2010/wordprocessingCanvas" xmlns:cx="http://schemas.microsoft.com/office/drawing/2014/chartex" xmlns:cx1="http://schemas.microsoft.com/office/drawing/2015/9/8/chartex" xmlns:cx2="http://schemas.microsoft.com/office/drawing/2015/10/21/chartex" xmlns:cx3="http://schemas.microsoft.com/office/drawing/2016/5/9/chartex" xmlns:cx4="http://schemas.microsoft.com/office/drawing/2016/5/10/chartex" xmlns:cx5="http://schemas.microsoft.com/office/drawing/2016/5/11/chartex" xmlns:cx6="http://schemas.microsoft.com/office/drawing/2016/5/12/chartex" xmlns:cx7="http://schemas.microsoft.com/office/drawing/2016/5/13/chartex" xmlns:cx8="http://schemas.microsoft.com/office/drawing/2016/5/14/chartex" xmlns:mc="http://schemas.openxmlformats.org/markup-compatibility/2006" xmlns:aink="http://schemas.microsoft.com/office/drawing/2016/ink" xmlns:am3d="http://schemas.microsoft.com/office/drawing/2017/model3d" xmlns:o="urn:schemas-microsoft-com:office:office" xmlns:oel="http://schemas.microsoft.com/office/2019/extlst" xmlns:r="http://schemas.openxmlformats.org/officeDocument/2006/relationships" xmlns:m="http://schemas.openxmlformats.org/officeDocument/2006/math" xmlns:v="urn:schemas-microsoft-com:vml" xmlns:wp14="http://schemas.microsoft.com/office/word/2010/wordprocessingDrawing" xmlns:wp="http://schemas.openxmlformats.org/drawingml/2006/wordprocessingDrawing" xmlns:w10="urn:schemas-microsoft-com:office:word" xmlns:w="http://schemas.openxmlformats.org/wordprocessingml/2006/main" xmlns:w14="http://schemas.microsoft.com/office/word/2010/wordml" xmlns:w15="http://schemas.microsoft.com/office/word/2012/wordml" xmlns:w16cei="http://schemas.microsoft.com/office/word/2026/wordml/cei" xmlns:w16cex="http://schemas.microsoft.com/office/word/2018/wordml/cex" xmlns:w16cid="http://schemas.microsoft.com/office/word/2016/wordml/cid" xmlns:w16="http://schemas.microsoft.com/office/word/2018/wordml" xmlns:w16du="http://schemas.microsoft.com/office/word/2023/wordml/word16du" xmlns:w16sdtdh="http://schemas.microsoft.com/office/word/2020/wordml/sdtdatahash" xmlns:w16sdtfl="http://schemas.microsoft.com/office/word/2024/wordml/sdtformatlock" xmlns:w16se="http://schemas.microsoft.com/office/word/2015/wordml/symex" xmlns:wpg="http://schemas.microsoft.com/office/word/2010/wordprocessingGroup" xmlns:wpi="http://schemas.microsoft.com/office/word/2010/wordprocessingInk" xmlns:wne="http://schemas.microsoft.com/office/word/2006/wordml" xmlns:wps="http://schemas.microsoft.com/office/word/2010/wordprocessingShape" mc:Ignorable="w14 w15 w16se w16cid w16 w16cex w16sdtdh w16sdtfl w16du wp14">
+<w:ftr xmlns:wpc="http://schemas.microsoft.com/office/word/2010/wordprocessingCanvas" xmlns:cx="http://schemas.microsoft.com/office/drawing/2014/chartex" xmlns:cx1="http://schemas.microsoft.com/office/drawing/2015/9/8/chartex" xmlns:cx2="http://schemas.microsoft.com/office/drawing/2015/10/21/chartex" xmlns:cx3="http://schemas.microsoft.com/office/drawing/2016/5/9/chartex" xmlns:cx4="http://schemas.microsoft.com/office/drawing/2016/5/10/chartex" xmlns:cx5="http://schemas.microsoft.com/office/drawing/2016/5/11/chartex" xmlns:cx6="http://schemas.microsoft.com/office/drawing/2016/5/12/chartex" xmlns:cx7="http://schemas.microsoft.com/office/drawing/2016/5/13/chartex" xmlns:cx8="http://schemas.microsoft.com/office/drawing/2016/5/14/chartex" xmlns:mc="http://schemas.openxmlformats.org/markup-compatibility/2006" xmlns:aink="http://schemas.microsoft.com/office/drawing/2016/ink" xmlns:am3d="http://schemas.microsoft.com/office/drawing/2017/model3d" xmlns:o="urn:schemas-microsoft-com:office:office" xmlns:oel="http://schemas.microsoft.com/office/2019/extlst" xmlns:r="http://schemas.openxmlformats.org/officeDocument/2006/relationships" xmlns:m="http://schemas.openxmlformats.org/officeDocument/2006/math" xmlns:v="urn:schemas-microsoft-com:vml" xmlns:wp14="http://schemas.microsoft.com/office/word/2010/wordprocessingDrawing" xmlns:wp="http://schemas.openxmlformats.org/drawingml/2006/wordprocessingDrawing" xmlns:w10="urn:schemas-microsoft-com:office:word" xmlns:w="http://schemas.openxmlformats.org/wordprocessingml/2006/main" xmlns:w14="http://schemas.microsoft.com/office/word/2010/wordml" xmlns:w15="http://schemas.microsoft.com/office/word/2012/wordml" xmlns:w16cex="http://schemas.microsoft.com/office/word/2018/wordml/cex" xmlns:w16cid="http://schemas.microsoft.com/office/word/2016/wordml/cid" xmlns:w16="http://schemas.microsoft.com/office/word/2018/wordml" xmlns:w16du="http://schemas.microsoft.com/office/word/2023/wordml/word16du" xmlns:w16sdtdh="http://schemas.microsoft.com/office/word/2020/wordml/sdtdatahash" xmlns:w16sdtfl="http://schemas.microsoft.com/office/word/2024/wordml/sdtformatlock" xmlns:w16se="http://schemas.microsoft.com/office/word/2015/wordml/symex" xmlns:wpg="http://schemas.microsoft.com/office/word/2010/wordprocessingGroup" xmlns:wpi="http://schemas.microsoft.com/office/word/2010/wordprocessingInk" xmlns:wne="http://schemas.microsoft.com/office/word/2006/wordml" xmlns:wps="http://schemas.microsoft.com/office/word/2010/wordprocessingShape" mc:Ignorable="w14 w15 w16se w16cid w16 w16cex w16sdtdh w16sdtfl w16du wp14">
   <w:p>
     <w:pPr>
       <w:pBdr>
@@ -1602,7 +1849,7 @@
 </file>
 
 <file path=word/footer5.xml><?xml version="1.0" encoding="utf-8"?>
-<w:ftr xmlns:wpc="http://schemas.microsoft.com/office/word/2010/wordprocessingCanvas" xmlns:cx="http://schemas.microsoft.com/office/drawing/2014/chartex" xmlns:cx1="http://schemas.microsoft.com/office/drawing/2015/9/8/chartex" xmlns:cx2="http://schemas.microsoft.com/office/drawing/2015/10/21/chartex" xmlns:cx3="http://schemas.microsoft.com/office/drawing/2016/5/9/chartex" xmlns:cx4="http://schemas.microsoft.com/office/drawing/2016/5/10/chartex" xmlns:cx5="http://schemas.microsoft.com/office/drawing/2016/5/11/chartex" xmlns:cx6="http://schemas.microsoft.com/office/drawing/2016/5/12/chartex" xmlns:cx7="http://schemas.microsoft.com/office/drawing/2016/5/13/chartex" xmlns:cx8="http://schemas.microsoft.com/office/drawing/2016/5/14/chartex" xmlns:mc="http://schemas.openxmlformats.org/markup-compatibility/2006" xmlns:aink="http://schemas.microsoft.com/office/drawing/2016/ink" xmlns:am3d="http://schemas.microsoft.com/office/drawing/2017/model3d" xmlns:o="urn:schemas-microsoft-com:office:office" xmlns:oel="http://schemas.microsoft.com/office/2019/extlst" xmlns:r="http://schemas.openxmlformats.org/officeDocument/2006/relationships" xmlns:m="http://schemas.openxmlformats.org/officeDocument/2006/math" xmlns:v="urn:schemas-microsoft-com:vml" xmlns:wp14="http://schemas.microsoft.com/office/word/2010/wordprocessingDrawing" xmlns:wp="http://schemas.openxmlformats.org/drawingml/2006/wordprocessingDrawing" xmlns:w10="urn:schemas-microsoft-com:office:word" xmlns:w="http://schemas.openxmlformats.org/wordprocessingml/2006/main" xmlns:w14="http://schemas.microsoft.com/office/word/2010/wordml" xmlns:w15="http://schemas.microsoft.com/office/word/2012/wordml" xmlns:w16cei="http://schemas.microsoft.com/office/word/2026/wordml/cei" xmlns:w16cex="http://schemas.microsoft.com/office/word/2018/wordml/cex" xmlns:w16cid="http://schemas.microsoft.com/office/word/2016/wordml/cid" xmlns:w16="http://schemas.microsoft.com/office/word/2018/wordml" xmlns:w16du="http://schemas.microsoft.com/office/word/2023/wordml/word16du" xmlns:w16sdtdh="http://schemas.microsoft.com/office/word/2020/wordml/sdtdatahash" xmlns:w16sdtfl="http://schemas.microsoft.com/office/word/2024/wordml/sdtformatlock" xmlns:w16se="http://schemas.microsoft.com/office/word/2015/wordml/symex" xmlns:wpg="http://schemas.microsoft.com/office/word/2010/wordprocessingGroup" xmlns:wpi="http://schemas.microsoft.com/office/word/2010/wordprocessingInk" xmlns:wne="http://schemas.microsoft.com/office/word/2006/wordml" xmlns:wps="http://schemas.microsoft.com/office/word/2010/wordprocessingShape" mc:Ignorable="w14 w15 w16se w16cid w16 w16cex w16sdtdh w16sdtfl w16du wp14">
+<w:ftr xmlns:wpc="http://schemas.microsoft.com/office/word/2010/wordprocessingCanvas" xmlns:cx="http://schemas.microsoft.com/office/drawing/2014/chartex" xmlns:cx1="http://schemas.microsoft.com/office/drawing/2015/9/8/chartex" xmlns:cx2="http://schemas.microsoft.com/office/drawing/2015/10/21/chartex" xmlns:cx3="http://schemas.microsoft.com/office/drawing/2016/5/9/chartex" xmlns:cx4="http://schemas.microsoft.com/office/drawing/2016/5/10/chartex" xmlns:cx5="http://schemas.microsoft.com/office/drawing/2016/5/11/chartex" xmlns:cx6="http://schemas.microsoft.com/office/drawing/2016/5/12/chartex" xmlns:cx7="http://schemas.microsoft.com/office/drawing/2016/5/13/chartex" xmlns:cx8="http://schemas.microsoft.com/office/drawing/2016/5/14/chartex" xmlns:mc="http://schemas.openxmlformats.org/markup-compatibility/2006" xmlns:aink="http://schemas.microsoft.com/office/drawing/2016/ink" xmlns:am3d="http://schemas.microsoft.com/office/drawing/2017/model3d" xmlns:o="urn:schemas-microsoft-com:office:office" xmlns:oel="http://schemas.microsoft.com/office/2019/extlst" xmlns:r="http://schemas.openxmlformats.org/officeDocument/2006/relationships" xmlns:m="http://schemas.openxmlformats.org/officeDocument/2006/math" xmlns:v="urn:schemas-microsoft-com:vml" xmlns:wp14="http://schemas.microsoft.com/office/word/2010/wordprocessingDrawing" xmlns:wp="http://schemas.openxmlformats.org/drawingml/2006/wordprocessingDrawing" xmlns:w10="urn:schemas-microsoft-com:office:word" xmlns:w="http://schemas.openxmlformats.org/wordprocessingml/2006/main" xmlns:w14="http://schemas.microsoft.com/office/word/2010/wordml" xmlns:w15="http://schemas.microsoft.com/office/word/2012/wordml" xmlns:w16cex="http://schemas.microsoft.com/office/word/2018/wordml/cex" xmlns:w16cid="http://schemas.microsoft.com/office/word/2016/wordml/cid" xmlns:w16="http://schemas.microsoft.com/office/word/2018/wordml" xmlns:w16du="http://schemas.microsoft.com/office/word/2023/wordml/word16du" xmlns:w16sdtdh="http://schemas.microsoft.com/office/word/2020/wordml/sdtdatahash" xmlns:w16sdtfl="http://schemas.microsoft.com/office/word/2024/wordml/sdtformatlock" xmlns:w16se="http://schemas.microsoft.com/office/word/2015/wordml/symex" xmlns:wpg="http://schemas.microsoft.com/office/word/2010/wordprocessingGroup" xmlns:wpi="http://schemas.microsoft.com/office/word/2010/wordprocessingInk" xmlns:wne="http://schemas.microsoft.com/office/word/2006/wordml" xmlns:wps="http://schemas.microsoft.com/office/word/2010/wordprocessingShape" mc:Ignorable="w14 w15 w16se w16cid w16 w16cex w16sdtdh w16sdtfl w16du wp14">
   <w:p>
     <w:pPr>
       <w:pBdr>
@@ -1625,7 +1872,7 @@
 </file>
 
 <file path=word/footnotes.xml><?xml version="1.0" encoding="utf-8"?>
-<w:footnotes xmlns:wpc="http://schemas.microsoft.com/office/word/2010/wordprocessingCanvas" xmlns:cx="http://schemas.microsoft.com/office/drawing/2014/chartex" xmlns:cx1="http://schemas.microsoft.com/office/drawing/2015/9/8/chartex" xmlns:cx2="http://schemas.microsoft.com/office/drawing/2015/10/21/chartex" xmlns:cx3="http://schemas.microsoft.com/office/drawing/2016/5/9/chartex" xmlns:cx4="http://schemas.microsoft.com/office/drawing/2016/5/10/chartex" xmlns:cx5="http://schemas.microsoft.com/office/drawing/2016/5/11/chartex" xmlns:cx6="http://schemas.microsoft.com/office/drawing/2016/5/12/chartex" xmlns:cx7="http://schemas.microsoft.com/office/drawing/2016/5/13/chartex" xmlns:cx8="http://schemas.microsoft.com/office/drawing/2016/5/14/chartex" xmlns:mc="http://schemas.openxmlformats.org/markup-compatibility/2006" xmlns:aink="http://schemas.microsoft.com/office/drawing/2016/ink" xmlns:am3d="http://schemas.microsoft.com/office/drawing/2017/model3d" xmlns:o="urn:schemas-microsoft-com:office:office" xmlns:oel="http://schemas.microsoft.com/office/2019/extlst" xmlns:r="http://schemas.openxmlformats.org/officeDocument/2006/relationships" xmlns:m="http://schemas.openxmlformats.org/officeDocument/2006/math" xmlns:v="urn:schemas-microsoft-com:vml" xmlns:wp14="http://schemas.microsoft.com/office/word/2010/wordprocessingDrawing" xmlns:wp="http://schemas.openxmlformats.org/drawingml/2006/wordprocessingDrawing" xmlns:w10="urn:schemas-microsoft-com:office:word" xmlns:w="http://schemas.openxmlformats.org/wordprocessingml/2006/main" xmlns:w14="http://schemas.microsoft.com/office/word/2010/wordml" xmlns:w15="http://schemas.microsoft.com/office/word/2012/wordml" xmlns:w16cei="http://schemas.microsoft.com/office/word/2026/wordml/cei" xmlns:w16cex="http://schemas.microsoft.com/office/word/2018/wordml/cex" xmlns:w16cid="http://schemas.microsoft.com/office/word/2016/wordml/cid" xmlns:w16="http://schemas.microsoft.com/office/word/2018/wordml" xmlns:w16du="http://schemas.microsoft.com/office/word/2023/wordml/word16du" xmlns:w16sdtdh="http://schemas.microsoft.com/office/word/2020/wordml/sdtdatahash" xmlns:w16sdtfl="http://schemas.microsoft.com/office/word/2024/wordml/sdtformatlock" xmlns:w16se="http://schemas.microsoft.com/office/word/2015/wordml/symex" xmlns:wpg="http://schemas.microsoft.com/office/word/2010/wordprocessingGroup" xmlns:wpi="http://schemas.microsoft.com/office/word/2010/wordprocessingInk" xmlns:wne="http://schemas.microsoft.com/office/word/2006/wordml" xmlns:wps="http://schemas.microsoft.com/office/word/2010/wordprocessingShape" mc:Ignorable="w14 w15 w16se w16cid w16 w16cex w16sdtdh w16sdtfl w16du wp14">
+<w:footnotes xmlns:wpc="http://schemas.microsoft.com/office/word/2010/wordprocessingCanvas" xmlns:cx="http://schemas.microsoft.com/office/drawing/2014/chartex" xmlns:cx1="http://schemas.microsoft.com/office/drawing/2015/9/8/chartex" xmlns:cx2="http://schemas.microsoft.com/office/drawing/2015/10/21/chartex" xmlns:cx3="http://schemas.microsoft.com/office/drawing/2016/5/9/chartex" xmlns:cx4="http://schemas.microsoft.com/office/drawing/2016/5/10/chartex" xmlns:cx5="http://schemas.microsoft.com/office/drawing/2016/5/11/chartex" xmlns:cx6="http://schemas.microsoft.com/office/drawing/2016/5/12/chartex" xmlns:cx7="http://schemas.microsoft.com/office/drawing/2016/5/13/chartex" xmlns:cx8="http://schemas.microsoft.com/office/drawing/2016/5/14/chartex" xmlns:mc="http://schemas.openxmlformats.org/markup-compatibility/2006" xmlns:aink="http://schemas.microsoft.com/office/drawing/2016/ink" xmlns:am3d="http://schemas.microsoft.com/office/drawing/2017/model3d" xmlns:o="urn:schemas-microsoft-com:office:office" xmlns:oel="http://schemas.microsoft.com/office/2019/extlst" xmlns:r="http://schemas.openxmlformats.org/officeDocument/2006/relationships" xmlns:m="http://schemas.openxmlformats.org/officeDocument/2006/math" xmlns:v="urn:schemas-microsoft-com:vml" xmlns:wp14="http://schemas.microsoft.com/office/word/2010/wordprocessingDrawing" xmlns:wp="http://schemas.openxmlformats.org/drawingml/2006/wordprocessingDrawing" xmlns:w10="urn:schemas-microsoft-com:office:word" xmlns:w="http://schemas.openxmlformats.org/wordprocessingml/2006/main" xmlns:w14="http://schemas.microsoft.com/office/word/2010/wordml" xmlns:w15="http://schemas.microsoft.com/office/word/2012/wordml" xmlns:w16cex="http://schemas.microsoft.com/office/word/2018/wordml/cex" xmlns:w16cid="http://schemas.microsoft.com/office/word/2016/wordml/cid" xmlns:w16="http://schemas.microsoft.com/office/word/2018/wordml" xmlns:w16du="http://schemas.microsoft.com/office/word/2023/wordml/word16du" xmlns:w16sdtdh="http://schemas.microsoft.com/office/word/2020/wordml/sdtdatahash" xmlns:w16sdtfl="http://schemas.microsoft.com/office/word/2024/wordml/sdtformatlock" xmlns:w16se="http://schemas.microsoft.com/office/word/2015/wordml/symex" xmlns:wpg="http://schemas.microsoft.com/office/word/2010/wordprocessingGroup" xmlns:wpi="http://schemas.microsoft.com/office/word/2010/wordprocessingInk" xmlns:wne="http://schemas.microsoft.com/office/word/2006/wordml" xmlns:wps="http://schemas.microsoft.com/office/word/2010/wordprocessingShape" mc:Ignorable="w14 w15 w16se w16cid w16 w16cex w16sdtdh w16sdtfl w16du wp14">
   <w:footnote w:type="separator" w:id="-1">
     <w:p>
       <w:r>
@@ -1644,7 +1891,7 @@
 </file>
 
 <file path=word/header1.xml><?xml version="1.0" encoding="utf-8"?>
-<w:hdr xmlns:wpc="http://schemas.microsoft.com/office/word/2010/wordprocessingCanvas" xmlns:cx="http://schemas.microsoft.com/office/drawing/2014/chartex" xmlns:cx1="http://schemas.microsoft.com/office/drawing/2015/9/8/chartex" xmlns:cx2="http://schemas.microsoft.com/office/drawing/2015/10/21/chartex" xmlns:cx3="http://schemas.microsoft.com/office/drawing/2016/5/9/chartex" xmlns:cx4="http://schemas.microsoft.com/office/drawing/2016/5/10/chartex" xmlns:cx5="http://schemas.microsoft.com/office/drawing/2016/5/11/chartex" xmlns:cx6="http://schemas.microsoft.com/office/drawing/2016/5/12/chartex" xmlns:cx7="http://schemas.microsoft.com/office/drawing/2016/5/13/chartex" xmlns:cx8="http://schemas.microsoft.com/office/drawing/2016/5/14/chartex" xmlns:mc="http://schemas.openxmlformats.org/markup-compatibility/2006" xmlns:aink="http://schemas.microsoft.com/office/drawing/2016/ink" xmlns:am3d="http://schemas.microsoft.com/office/drawing/2017/model3d" xmlns:o="urn:schemas-microsoft-com:office:office" xmlns:oel="http://schemas.microsoft.com/office/2019/extlst" xmlns:r="http://schemas.openxmlformats.org/officeDocument/2006/relationships" xmlns:m="http://schemas.openxmlformats.org/officeDocument/2006/math" xmlns:v="urn:schemas-microsoft-com:vml" xmlns:wp14="http://schemas.microsoft.com/office/word/2010/wordprocessingDrawing" xmlns:wp="http://schemas.openxmlformats.org/drawingml/2006/wordprocessingDrawing" xmlns:w10="urn:schemas-microsoft-com:office:word" xmlns:w="http://schemas.openxmlformats.org/wordprocessingml/2006/main" xmlns:w14="http://schemas.microsoft.com/office/word/2010/wordml" xmlns:w15="http://schemas.microsoft.com/office/word/2012/wordml" xmlns:w16cei="http://schemas.microsoft.com/office/word/2026/wordml/cei" xmlns:w16cex="http://schemas.microsoft.com/office/word/2018/wordml/cex" xmlns:w16cid="http://schemas.microsoft.com/office/word/2016/wordml/cid" xmlns:w16="http://schemas.microsoft.com/office/word/2018/wordml" xmlns:w16du="http://schemas.microsoft.com/office/word/2023/wordml/word16du" xmlns:w16sdtdh="http://schemas.microsoft.com/office/word/2020/wordml/sdtdatahash" xmlns:w16sdtfl="http://schemas.microsoft.com/office/word/2024/wordml/sdtformatlock" xmlns:w16se="http://schemas.microsoft.com/office/word/2015/wordml/symex" xmlns:wpg="http://schemas.microsoft.com/office/word/2010/wordprocessingGroup" xmlns:wpi="http://schemas.microsoft.com/office/word/2010/wordprocessingInk" xmlns:wne="http://schemas.microsoft.com/office/word/2006/wordml" xmlns:wps="http://schemas.microsoft.com/office/word/2010/wordprocessingShape" mc:Ignorable="w14 w15 w16se w16cid w16 w16cex w16sdtdh w16sdtfl w16du wp14">
+<w:hdr xmlns:wpc="http://schemas.microsoft.com/office/word/2010/wordprocessingCanvas" xmlns:cx="http://schemas.microsoft.com/office/drawing/2014/chartex" xmlns:cx1="http://schemas.microsoft.com/office/drawing/2015/9/8/chartex" xmlns:cx2="http://schemas.microsoft.com/office/drawing/2015/10/21/chartex" xmlns:cx3="http://schemas.microsoft.com/office/drawing/2016/5/9/chartex" xmlns:cx4="http://schemas.microsoft.com/office/drawing/2016/5/10/chartex" xmlns:cx5="http://schemas.microsoft.com/office/drawing/2016/5/11/chartex" xmlns:cx6="http://schemas.microsoft.com/office/drawing/2016/5/12/chartex" xmlns:cx7="http://schemas.microsoft.com/office/drawing/2016/5/13/chartex" xmlns:cx8="http://schemas.microsoft.com/office/drawing/2016/5/14/chartex" xmlns:mc="http://schemas.openxmlformats.org/markup-compatibility/2006" xmlns:aink="http://schemas.microsoft.com/office/drawing/2016/ink" xmlns:am3d="http://schemas.microsoft.com/office/drawing/2017/model3d" xmlns:o="urn:schemas-microsoft-com:office:office" xmlns:oel="http://schemas.microsoft.com/office/2019/extlst" xmlns:r="http://schemas.openxmlformats.org/officeDocument/2006/relationships" xmlns:m="http://schemas.openxmlformats.org/officeDocument/2006/math" xmlns:v="urn:schemas-microsoft-com:vml" xmlns:wp14="http://schemas.microsoft.com/office/word/2010/wordprocessingDrawing" xmlns:wp="http://schemas.openxmlformats.org/drawingml/2006/wordprocessingDrawing" xmlns:w10="urn:schemas-microsoft-com:office:word" xmlns:w="http://schemas.openxmlformats.org/wordprocessingml/2006/main" xmlns:w14="http://schemas.microsoft.com/office/word/2010/wordml" xmlns:w15="http://schemas.microsoft.com/office/word/2012/wordml" xmlns:w16cex="http://schemas.microsoft.com/office/word/2018/wordml/cex" xmlns:w16cid="http://schemas.microsoft.com/office/word/2016/wordml/cid" xmlns:w16="http://schemas.microsoft.com/office/word/2018/wordml" xmlns:w16du="http://schemas.microsoft.com/office/word/2023/wordml/word16du" xmlns:w16sdtdh="http://schemas.microsoft.com/office/word/2020/wordml/sdtdatahash" xmlns:w16sdtfl="http://schemas.microsoft.com/office/word/2024/wordml/sdtformatlock" xmlns:w16se="http://schemas.microsoft.com/office/word/2015/wordml/symex" xmlns:wpg="http://schemas.microsoft.com/office/word/2010/wordprocessingGroup" xmlns:wpi="http://schemas.microsoft.com/office/word/2010/wordprocessingInk" xmlns:wne="http://schemas.microsoft.com/office/word/2006/wordml" xmlns:wps="http://schemas.microsoft.com/office/word/2010/wordprocessingShape" mc:Ignorable="w14 w15 w16se w16cid w16 w16cex w16sdtdh w16sdtfl w16du wp14">
   <w:p>
     <w:pPr>
       <w:pBdr>
@@ -1667,7 +1914,7 @@
 </file>
 
 <file path=word/header2.xml><?xml version="1.0" encoding="utf-8"?>
-<w:hdr xmlns:wpc="http://schemas.microsoft.com/office/word/2010/wordprocessingCanvas" xmlns:cx="http://schemas.microsoft.com/office/drawing/2014/chartex" xmlns:cx1="http://schemas.microsoft.com/office/drawing/2015/9/8/chartex" xmlns:cx2="http://schemas.microsoft.com/office/drawing/2015/10/21/chartex" xmlns:cx3="http://schemas.microsoft.com/office/drawing/2016/5/9/chartex" xmlns:cx4="http://schemas.microsoft.com/office/drawing/2016/5/10/chartex" xmlns:cx5="http://schemas.microsoft.com/office/drawing/2016/5/11/chartex" xmlns:cx6="http://schemas.microsoft.com/office/drawing/2016/5/12/chartex" xmlns:cx7="http://schemas.microsoft.com/office/drawing/2016/5/13/chartex" xmlns:cx8="http://schemas.microsoft.com/office/drawing/2016/5/14/chartex" xmlns:mc="http://schemas.openxmlformats.org/markup-compatibility/2006" xmlns:aink="http://schemas.microsoft.com/office/drawing/2016/ink" xmlns:am3d="http://schemas.microsoft.com/office/drawing/2017/model3d" xmlns:o="urn:schemas-microsoft-com:office:office" xmlns:oel="http://schemas.microsoft.com/office/2019/extlst" xmlns:r="http://schemas.openxmlformats.org/officeDocument/2006/relationships" xmlns:m="http://schemas.openxmlformats.org/officeDocument/2006/math" xmlns:v="urn:schemas-microsoft-com:vml" xmlns:wp14="http://schemas.microsoft.com/office/word/2010/wordprocessingDrawing" xmlns:wp="http://schemas.openxmlformats.org/drawingml/2006/wordprocessingDrawing" xmlns:w10="urn:schemas-microsoft-com:office:word" xmlns:w="http://schemas.openxmlformats.org/wordprocessingml/2006/main" xmlns:w14="http://schemas.microsoft.com/office/word/2010/wordml" xmlns:w15="http://schemas.microsoft.com/office/word/2012/wordml" xmlns:w16cei="http://schemas.microsoft.com/office/word/2026/wordml/cei" xmlns:w16cex="http://schemas.microsoft.com/office/word/2018/wordml/cex" xmlns:w16cid="http://schemas.microsoft.com/office/word/2016/wordml/cid" xmlns:w16="http://schemas.microsoft.com/office/word/2018/wordml" xmlns:w16du="http://schemas.microsoft.com/office/word/2023/wordml/word16du" xmlns:w16sdtdh="http://schemas.microsoft.com/office/word/2020/wordml/sdtdatahash" xmlns:w16sdtfl="http://schemas.microsoft.com/office/word/2024/wordml/sdtformatlock" xmlns:w16se="http://schemas.microsoft.com/office/word/2015/wordml/symex" xmlns:wpg="http://schemas.microsoft.com/office/word/2010/wordprocessingGroup" xmlns:wpi="http://schemas.microsoft.com/office/word/2010/wordprocessingInk" xmlns:wne="http://schemas.microsoft.com/office/word/2006/wordml" xmlns:wps="http://schemas.microsoft.com/office/word/2010/wordprocessingShape" mc:Ignorable="w14 w15 w16se w16cid w16 w16cex w16sdtdh w16sdtfl w16du wp14">
+<w:hdr xmlns:wpc="http://schemas.microsoft.com/office/word/2010/wordprocessingCanvas" xmlns:cx="http://schemas.microsoft.com/office/drawing/2014/chartex" xmlns:cx1="http://schemas.microsoft.com/office/drawing/2015/9/8/chartex" xmlns:cx2="http://schemas.microsoft.com/office/drawing/2015/10/21/chartex" xmlns:cx3="http://schemas.microsoft.com/office/drawing/2016/5/9/chartex" xmlns:cx4="http://schemas.microsoft.com/office/drawing/2016/5/10/chartex" xmlns:cx5="http://schemas.microsoft.com/office/drawing/2016/5/11/chartex" xmlns:cx6="http://schemas.microsoft.com/office/drawing/2016/5/12/chartex" xmlns:cx7="http://schemas.microsoft.com/office/drawing/2016/5/13/chartex" xmlns:cx8="http://schemas.microsoft.com/office/drawing/2016/5/14/chartex" xmlns:mc="http://schemas.openxmlformats.org/markup-compatibility/2006" xmlns:aink="http://schemas.microsoft.com/office/drawing/2016/ink" xmlns:am3d="http://schemas.microsoft.com/office/drawing/2017/model3d" xmlns:o="urn:schemas-microsoft-com:office:office" xmlns:oel="http://schemas.microsoft.com/office/2019/extlst" xmlns:r="http://schemas.openxmlformats.org/officeDocument/2006/relationships" xmlns:m="http://schemas.openxmlformats.org/officeDocument/2006/math" xmlns:v="urn:schemas-microsoft-com:vml" xmlns:wp14="http://schemas.microsoft.com/office/word/2010/wordprocessingDrawing" xmlns:wp="http://schemas.openxmlformats.org/drawingml/2006/wordprocessingDrawing" xmlns:w10="urn:schemas-microsoft-com:office:word" xmlns:w="http://schemas.openxmlformats.org/wordprocessingml/2006/main" xmlns:w14="http://schemas.microsoft.com/office/word/2010/wordml" xmlns:w15="http://schemas.microsoft.com/office/word/2012/wordml" xmlns:w16cex="http://schemas.microsoft.com/office/word/2018/wordml/cex" xmlns:w16cid="http://schemas.microsoft.com/office/word/2016/wordml/cid" xmlns:w16="http://schemas.microsoft.com/office/word/2018/wordml" xmlns:w16du="http://schemas.microsoft.com/office/word/2023/wordml/word16du" xmlns:w16sdtdh="http://schemas.microsoft.com/office/word/2020/wordml/sdtdatahash" xmlns:w16sdtfl="http://schemas.microsoft.com/office/word/2024/wordml/sdtformatlock" xmlns:w16se="http://schemas.microsoft.com/office/word/2015/wordml/symex" xmlns:wpg="http://schemas.microsoft.com/office/word/2010/wordprocessingGroup" xmlns:wpi="http://schemas.microsoft.com/office/word/2010/wordprocessingInk" xmlns:wne="http://schemas.microsoft.com/office/word/2006/wordml" xmlns:wps="http://schemas.microsoft.com/office/word/2010/wordprocessingShape" mc:Ignorable="w14 w15 w16se w16cid w16 w16cex w16sdtdh w16sdtfl w16du wp14">
   <w:p>
     <w:pPr>
       <w:rPr>
@@ -1698,7 +1945,7 @@
 </file>
 
 <file path=word/header3.xml><?xml version="1.0" encoding="utf-8"?>
-<w:hdr xmlns:wpc="http://schemas.microsoft.com/office/word/2010/wordprocessingCanvas" xmlns:cx="http://schemas.microsoft.com/office/drawing/2014/chartex" xmlns:cx1="http://schemas.microsoft.com/office/drawing/2015/9/8/chartex" xmlns:cx2="http://schemas.microsoft.com/office/drawing/2015/10/21/chartex" xmlns:cx3="http://schemas.microsoft.com/office/drawing/2016/5/9/chartex" xmlns:cx4="http://schemas.microsoft.com/office/drawing/2016/5/10/chartex" xmlns:cx5="http://schemas.microsoft.com/office/drawing/2016/5/11/chartex" xmlns:cx6="http://schemas.microsoft.com/office/drawing/2016/5/12/chartex" xmlns:cx7="http://schemas.microsoft.com/office/drawing/2016/5/13/chartex" xmlns:cx8="http://schemas.microsoft.com/office/drawing/2016/5/14/chartex" xmlns:mc="http://schemas.openxmlformats.org/markup-compatibility/2006" xmlns:aink="http://schemas.microsoft.com/office/drawing/2016/ink" xmlns:am3d="http://schemas.microsoft.com/office/drawing/2017/model3d" xmlns:o="urn:schemas-microsoft-com:office:office" xmlns:oel="http://schemas.microsoft.com/office/2019/extlst" xmlns:r="http://schemas.openxmlformats.org/officeDocument/2006/relationships" xmlns:m="http://schemas.openxmlformats.org/officeDocument/2006/math" xmlns:v="urn:schemas-microsoft-com:vml" xmlns:wp14="http://schemas.microsoft.com/office/word/2010/wordprocessingDrawing" xmlns:wp="http://schemas.openxmlformats.org/drawingml/2006/wordprocessingDrawing" xmlns:w10="urn:schemas-microsoft-com:office:word" xmlns:w="http://schemas.openxmlformats.org/wordprocessingml/2006/main" xmlns:w14="http://schemas.microsoft.com/office/word/2010/wordml" xmlns:w15="http://schemas.microsoft.com/office/word/2012/wordml" xmlns:w16cei="http://schemas.microsoft.com/office/word/2026/wordml/cei" xmlns:w16cex="http://schemas.microsoft.com/office/word/2018/wordml/cex" xmlns:w16cid="http://schemas.microsoft.com/office/word/2016/wordml/cid" xmlns:w16="http://schemas.microsoft.com/office/word/2018/wordml" xmlns:w16du="http://schemas.microsoft.com/office/word/2023/wordml/word16du" xmlns:w16sdtdh="http://schemas.microsoft.com/office/word/2020/wordml/sdtdatahash" xmlns:w16sdtfl="http://schemas.microsoft.com/office/word/2024/wordml/sdtformatlock" xmlns:w16se="http://schemas.microsoft.com/office/word/2015/wordml/symex" xmlns:wpg="http://schemas.microsoft.com/office/word/2010/wordprocessingGroup" xmlns:wpi="http://schemas.microsoft.com/office/word/2010/wordprocessingInk" xmlns:wne="http://schemas.microsoft.com/office/word/2006/wordml" xmlns:wps="http://schemas.microsoft.com/office/word/2010/wordprocessingShape" mc:Ignorable="w14 w15 w16se w16cid w16 w16cex w16sdtdh w16sdtfl w16du wp14">
+<w:hdr xmlns:wpc="http://schemas.microsoft.com/office/word/2010/wordprocessingCanvas" xmlns:cx="http://schemas.microsoft.com/office/drawing/2014/chartex" xmlns:cx1="http://schemas.microsoft.com/office/drawing/2015/9/8/chartex" xmlns:cx2="http://schemas.microsoft.com/office/drawing/2015/10/21/chartex" xmlns:cx3="http://schemas.microsoft.com/office/drawing/2016/5/9/chartex" xmlns:cx4="http://schemas.microsoft.com/office/drawing/2016/5/10/chartex" xmlns:cx5="http://schemas.microsoft.com/office/drawing/2016/5/11/chartex" xmlns:cx6="http://schemas.microsoft.com/office/drawing/2016/5/12/chartex" xmlns:cx7="http://schemas.microsoft.com/office/drawing/2016/5/13/chartex" xmlns:cx8="http://schemas.microsoft.com/office/drawing/2016/5/14/chartex" xmlns:mc="http://schemas.openxmlformats.org/markup-compatibility/2006" xmlns:aink="http://schemas.microsoft.com/office/drawing/2016/ink" xmlns:am3d="http://schemas.microsoft.com/office/drawing/2017/model3d" xmlns:o="urn:schemas-microsoft-com:office:office" xmlns:oel="http://schemas.microsoft.com/office/2019/extlst" xmlns:r="http://schemas.openxmlformats.org/officeDocument/2006/relationships" xmlns:m="http://schemas.openxmlformats.org/officeDocument/2006/math" xmlns:v="urn:schemas-microsoft-com:vml" xmlns:wp14="http://schemas.microsoft.com/office/word/2010/wordprocessingDrawing" xmlns:wp="http://schemas.openxmlformats.org/drawingml/2006/wordprocessingDrawing" xmlns:w10="urn:schemas-microsoft-com:office:word" xmlns:w="http://schemas.openxmlformats.org/wordprocessingml/2006/main" xmlns:w14="http://schemas.microsoft.com/office/word/2010/wordml" xmlns:w15="http://schemas.microsoft.com/office/word/2012/wordml" xmlns:w16cex="http://schemas.microsoft.com/office/word/2018/wordml/cex" xmlns:w16cid="http://schemas.microsoft.com/office/word/2016/wordml/cid" xmlns:w16="http://schemas.microsoft.com/office/word/2018/wordml" xmlns:w16du="http://schemas.microsoft.com/office/word/2023/wordml/word16du" xmlns:w16sdtdh="http://schemas.microsoft.com/office/word/2020/wordml/sdtdatahash" xmlns:w16sdtfl="http://schemas.microsoft.com/office/word/2024/wordml/sdtformatlock" xmlns:w16se="http://schemas.microsoft.com/office/word/2015/wordml/symex" xmlns:wpg="http://schemas.microsoft.com/office/word/2010/wordprocessingGroup" xmlns:wpi="http://schemas.microsoft.com/office/word/2010/wordprocessingInk" xmlns:wne="http://schemas.microsoft.com/office/word/2006/wordml" xmlns:wps="http://schemas.microsoft.com/office/word/2010/wordprocessingShape" mc:Ignorable="w14 w15 w16se w16cid w16 w16cex w16sdtdh w16sdtfl w16du wp14">
   <w:p>
     <w:pPr>
       <w:pBdr>
@@ -1721,7 +1968,7 @@
 </file>
 
 <file path=word/header4.xml><?xml version="1.0" encoding="utf-8"?>
-<w:hdr xmlns:wpc="http://schemas.microsoft.com/office/word/2010/wordprocessingCanvas" xmlns:cx="http://schemas.microsoft.com/office/drawing/2014/chartex" xmlns:cx1="http://schemas.microsoft.com/office/drawing/2015/9/8/chartex" xmlns:cx2="http://schemas.microsoft.com/office/drawing/2015/10/21/chartex" xmlns:cx3="http://schemas.microsoft.com/office/drawing/2016/5/9/chartex" xmlns:cx4="http://schemas.microsoft.com/office/drawing/2016/5/10/chartex" xmlns:cx5="http://schemas.microsoft.com/office/drawing/2016/5/11/chartex" xmlns:cx6="http://schemas.microsoft.com/office/drawing/2016/5/12/chartex" xmlns:cx7="http://schemas.microsoft.com/office/drawing/2016/5/13/chartex" xmlns:cx8="http://schemas.microsoft.com/office/drawing/2016/5/14/chartex" xmlns:mc="http://schemas.openxmlformats.org/markup-compatibility/2006" xmlns:aink="http://schemas.microsoft.com/office/drawing/2016/ink" xmlns:am3d="http://schemas.microsoft.com/office/drawing/2017/model3d" xmlns:o="urn:schemas-microsoft-com:office:office" xmlns:oel="http://schemas.microsoft.com/office/2019/extlst" xmlns:r="http://schemas.openxmlformats.org/officeDocument/2006/relationships" xmlns:m="http://schemas.openxmlformats.org/officeDocument/2006/math" xmlns:v="urn:schemas-microsoft-com:vml" xmlns:wp14="http://schemas.microsoft.com/office/word/2010/wordprocessingDrawing" xmlns:wp="http://schemas.openxmlformats.org/drawingml/2006/wordprocessingDrawing" xmlns:w10="urn:schemas-microsoft-com:office:word" xmlns:w="http://schemas.openxmlformats.org/wordprocessingml/2006/main" xmlns:w14="http://schemas.microsoft.com/office/word/2010/wordml" xmlns:w15="http://schemas.microsoft.com/office/word/2012/wordml" xmlns:w16cei="http://schemas.microsoft.com/office/word/2026/wordml/cei" xmlns:w16cex="http://schemas.microsoft.com/office/word/2018/wordml/cex" xmlns:w16cid="http://schemas.microsoft.com/office/word/2016/wordml/cid" xmlns:w16="http://schemas.microsoft.com/office/word/2018/wordml" xmlns:w16du="http://schemas.microsoft.com/office/word/2023/wordml/word16du" xmlns:w16sdtdh="http://schemas.microsoft.com/office/word/2020/wordml/sdtdatahash" xmlns:w16sdtfl="http://schemas.microsoft.com/office/word/2024/wordml/sdtformatlock" xmlns:w16se="http://schemas.microsoft.com/office/word/2015/wordml/symex" xmlns:wpg="http://schemas.microsoft.com/office/word/2010/wordprocessingGroup" xmlns:wpi="http://schemas.microsoft.com/office/word/2010/wordprocessingInk" xmlns:wne="http://schemas.microsoft.com/office/word/2006/wordml" xmlns:wps="http://schemas.microsoft.com/office/word/2010/wordprocessingShape" mc:Ignorable="w14 w15 w16se w16cid w16 w16cex w16sdtdh w16sdtfl w16du wp14">
+<w:hdr xmlns:wpc="http://schemas.microsoft.com/office/word/2010/wordprocessingCanvas" xmlns:cx="http://schemas.microsoft.com/office/drawing/2014/chartex" xmlns:cx1="http://schemas.microsoft.com/office/drawing/2015/9/8/chartex" xmlns:cx2="http://schemas.microsoft.com/office/drawing/2015/10/21/chartex" xmlns:cx3="http://schemas.microsoft.com/office/drawing/2016/5/9/chartex" xmlns:cx4="http://schemas.microsoft.com/office/drawing/2016/5/10/chartex" xmlns:cx5="http://schemas.microsoft.com/office/drawing/2016/5/11/chartex" xmlns:cx6="http://schemas.microsoft.com/office/drawing/2016/5/12/chartex" xmlns:cx7="http://schemas.microsoft.com/office/drawing/2016/5/13/chartex" xmlns:cx8="http://schemas.microsoft.com/office/drawing/2016/5/14/chartex" xmlns:mc="http://schemas.openxmlformats.org/markup-compatibility/2006" xmlns:aink="http://schemas.microsoft.com/office/drawing/2016/ink" xmlns:am3d="http://schemas.microsoft.com/office/drawing/2017/model3d" xmlns:o="urn:schemas-microsoft-com:office:office" xmlns:oel="http://schemas.microsoft.com/office/2019/extlst" xmlns:r="http://schemas.openxmlformats.org/officeDocument/2006/relationships" xmlns:m="http://schemas.openxmlformats.org/officeDocument/2006/math" xmlns:v="urn:schemas-microsoft-com:vml" xmlns:wp14="http://schemas.microsoft.com/office/word/2010/wordprocessingDrawing" xmlns:wp="http://schemas.openxmlformats.org/drawingml/2006/wordprocessingDrawing" xmlns:w10="urn:schemas-microsoft-com:office:word" xmlns:w="http://schemas.openxmlformats.org/wordprocessingml/2006/main" xmlns:w14="http://schemas.microsoft.com/office/word/2010/wordml" xmlns:w15="http://schemas.microsoft.com/office/word/2012/wordml" xmlns:w16cex="http://schemas.microsoft.com/office/word/2018/wordml/cex" xmlns:w16cid="http://schemas.microsoft.com/office/word/2016/wordml/cid" xmlns:w16="http://schemas.microsoft.com/office/word/2018/wordml" xmlns:w16du="http://schemas.microsoft.com/office/word/2023/wordml/word16du" xmlns:w16sdtdh="http://schemas.microsoft.com/office/word/2020/wordml/sdtdatahash" xmlns:w16sdtfl="http://schemas.microsoft.com/office/word/2024/wordml/sdtformatlock" xmlns:w16se="http://schemas.microsoft.com/office/word/2015/wordml/symex" xmlns:wpg="http://schemas.microsoft.com/office/word/2010/wordprocessingGroup" xmlns:wpi="http://schemas.microsoft.com/office/word/2010/wordprocessingInk" xmlns:wne="http://schemas.microsoft.com/office/word/2006/wordml" xmlns:wps="http://schemas.microsoft.com/office/word/2010/wordprocessingShape" mc:Ignorable="w14 w15 w16se w16cid w16 w16cex w16sdtdh w16sdtfl w16du wp14">
   <w:p>
     <w:pPr>
       <w:pBdr>
@@ -1744,7 +1991,7 @@
 </file>
 
 <file path=word/header5.xml><?xml version="1.0" encoding="utf-8"?>
-<w:hdr xmlns:wpc="http://schemas.microsoft.com/office/word/2010/wordprocessingCanvas" xmlns:cx="http://schemas.microsoft.com/office/drawing/2014/chartex" xmlns:cx1="http://schemas.microsoft.com/office/drawing/2015/9/8/chartex" xmlns:cx2="http://schemas.microsoft.com/office/drawing/2015/10/21/chartex" xmlns:cx3="http://schemas.microsoft.com/office/drawing/2016/5/9/chartex" xmlns:cx4="http://schemas.microsoft.com/office/drawing/2016/5/10/chartex" xmlns:cx5="http://schemas.microsoft.com/office/drawing/2016/5/11/chartex" xmlns:cx6="http://schemas.microsoft.com/office/drawing/2016/5/12/chartex" xmlns:cx7="http://schemas.microsoft.com/office/drawing/2016/5/13/chartex" xmlns:cx8="http://schemas.microsoft.com/office/drawing/2016/5/14/chartex" xmlns:mc="http://schemas.openxmlformats.org/markup-compatibility/2006" xmlns:aink="http://schemas.microsoft.com/office/drawing/2016/ink" xmlns:am3d="http://schemas.microsoft.com/office/drawing/2017/model3d" xmlns:o="urn:schemas-microsoft-com:office:office" xmlns:oel="http://schemas.microsoft.com/office/2019/extlst" xmlns:r="http://schemas.openxmlformats.org/officeDocument/2006/relationships" xmlns:m="http://schemas.openxmlformats.org/officeDocument/2006/math" xmlns:v="urn:schemas-microsoft-com:vml" xmlns:wp14="http://schemas.microsoft.com/office/word/2010/wordprocessingDrawing" xmlns:wp="http://schemas.openxmlformats.org/drawingml/2006/wordprocessingDrawing" xmlns:w10="urn:schemas-microsoft-com:office:word" xmlns:w="http://schemas.openxmlformats.org/wordprocessingml/2006/main" xmlns:w14="http://schemas.microsoft.com/office/word/2010/wordml" xmlns:w15="http://schemas.microsoft.com/office/word/2012/wordml" xmlns:w16cei="http://schemas.microsoft.com/office/word/2026/wordml/cei" xmlns:w16cex="http://schemas.microsoft.com/office/word/2018/wordml/cex" xmlns:w16cid="http://schemas.microsoft.com/office/word/2016/wordml/cid" xmlns:w16="http://schemas.microsoft.com/office/word/2018/wordml" xmlns:w16du="http://schemas.microsoft.com/office/word/2023/wordml/word16du" xmlns:w16sdtdh="http://schemas.microsoft.com/office/word/2020/wordml/sdtdatahash" xmlns:w16sdtfl="http://schemas.microsoft.com/office/word/2024/wordml/sdtformatlock" xmlns:w16se="http://schemas.microsoft.com/office/word/2015/wordml/symex" xmlns:wpg="http://schemas.microsoft.com/office/word/2010/wordprocessingGroup" xmlns:wpi="http://schemas.microsoft.com/office/word/2010/wordprocessingInk" xmlns:wne="http://schemas.microsoft.com/office/word/2006/wordml" xmlns:wps="http://schemas.microsoft.com/office/word/2010/wordprocessingShape" mc:Ignorable="w14 w15 w16se w16cid w16 w16cex w16sdtdh w16sdtfl w16du wp14">
+<w:hdr xmlns:wpc="http://schemas.microsoft.com/office/word/2010/wordprocessingCanvas" xmlns:cx="http://schemas.microsoft.com/office/drawing/2014/chartex" xmlns:cx1="http://schemas.microsoft.com/office/drawing/2015/9/8/chartex" xmlns:cx2="http://schemas.microsoft.com/office/drawing/2015/10/21/chartex" xmlns:cx3="http://schemas.microsoft.com/office/drawing/2016/5/9/chartex" xmlns:cx4="http://schemas.microsoft.com/office/drawing/2016/5/10/chartex" xmlns:cx5="http://schemas.microsoft.com/office/drawing/2016/5/11/chartex" xmlns:cx6="http://schemas.microsoft.com/office/drawing/2016/5/12/chartex" xmlns:cx7="http://schemas.microsoft.com/office/drawing/2016/5/13/chartex" xmlns:cx8="http://schemas.microsoft.com/office/drawing/2016/5/14/chartex" xmlns:mc="http://schemas.openxmlformats.org/markup-compatibility/2006" xmlns:aink="http://schemas.microsoft.com/office/drawing/2016/ink" xmlns:am3d="http://schemas.microsoft.com/office/drawing/2017/model3d" xmlns:o="urn:schemas-microsoft-com:office:office" xmlns:oel="http://schemas.microsoft.com/office/2019/extlst" xmlns:r="http://schemas.openxmlformats.org/officeDocument/2006/relationships" xmlns:m="http://schemas.openxmlformats.org/officeDocument/2006/math" xmlns:v="urn:schemas-microsoft-com:vml" xmlns:wp14="http://schemas.microsoft.com/office/word/2010/wordprocessingDrawing" xmlns:wp="http://schemas.openxmlformats.org/drawingml/2006/wordprocessingDrawing" xmlns:w10="urn:schemas-microsoft-com:office:word" xmlns:w="http://schemas.openxmlformats.org/wordprocessingml/2006/main" xmlns:w14="http://schemas.microsoft.com/office/word/2010/wordml" xmlns:w15="http://schemas.microsoft.com/office/word/2012/wordml" xmlns:w16cex="http://schemas.microsoft.com/office/word/2018/wordml/cex" xmlns:w16cid="http://schemas.microsoft.com/office/word/2016/wordml/cid" xmlns:w16="http://schemas.microsoft.com/office/word/2018/wordml" xmlns:w16du="http://schemas.microsoft.com/office/word/2023/wordml/word16du" xmlns:w16sdtdh="http://schemas.microsoft.com/office/word/2020/wordml/sdtdatahash" xmlns:w16sdtfl="http://schemas.microsoft.com/office/word/2024/wordml/sdtformatlock" xmlns:w16se="http://schemas.microsoft.com/office/word/2015/wordml/symex" xmlns:wpg="http://schemas.microsoft.com/office/word/2010/wordprocessingGroup" xmlns:wpi="http://schemas.microsoft.com/office/word/2010/wordprocessingInk" xmlns:wne="http://schemas.microsoft.com/office/word/2006/wordml" xmlns:wps="http://schemas.microsoft.com/office/word/2010/wordprocessingShape" mc:Ignorable="w14 w15 w16se w16cid w16 w16cex w16sdtdh w16sdtfl w16du wp14">
   <w:p>
     <w:pPr>
       <w:pBdr>
@@ -2288,6 +2535,7 @@
   <w:style w:type="character" w:default="1" w:styleId="Standardstycketeckensnitt">
     <w:name w:val="Default Paragraph Font"/>
     <w:uiPriority w:val="1"/>
+    <w:semiHidden/>
     <w:unhideWhenUsed/>
   </w:style>
   <w:style w:type="table" w:default="1" w:styleId="Normaltabell">
@@ -2385,6 +2633,52 @@
         <w:right w:w="15" w:type="dxa"/>
       </w:tblCellMar>
     </w:tblPr>
+  </w:style>
+  <w:style w:type="paragraph" w:styleId="Innehllsfrteckningsrubrik">
+    <w:name w:val="TOC Heading"/>
+    <w:basedOn w:val="Rubrik1"/>
+    <w:next w:val="Normal"/>
+    <w:uiPriority w:val="39"/>
+    <w:unhideWhenUsed/>
+    <w:qFormat/>
+    <w:rsid w:val="00574747"/>
+    <w:pPr>
+      <w:widowControl/>
+      <w:spacing w:before="240" w:after="0" w:line="259" w:lineRule="auto"/>
+      <w:outlineLvl w:val="9"/>
+    </w:pPr>
+    <w:rPr>
+      <w:rFonts w:asciiTheme="majorHAnsi" w:eastAsiaTheme="majorEastAsia" w:hAnsiTheme="majorHAnsi" w:cstheme="majorBidi"/>
+      <w:b w:val="0"/>
+      <w:bCs w:val="0"/>
+      <w:color w:val="365F91" w:themeColor="accent1" w:themeShade="BF"/>
+      <w:sz w:val="32"/>
+      <w:szCs w:val="32"/>
+      <w:lang w:val="sv-SE"/>
+    </w:rPr>
+  </w:style>
+  <w:style w:type="paragraph" w:styleId="Innehll1">
+    <w:name w:val="toc 1"/>
+    <w:basedOn w:val="Normal"/>
+    <w:next w:val="Normal"/>
+    <w:autoRedefine/>
+    <w:uiPriority w:val="39"/>
+    <w:unhideWhenUsed/>
+    <w:rsid w:val="00574747"/>
+    <w:pPr>
+      <w:spacing w:after="100"/>
+    </w:pPr>
+  </w:style>
+  <w:style w:type="character" w:styleId="Hyperlnk">
+    <w:name w:val="Hyperlink"/>
+    <w:basedOn w:val="Standardstycketeckensnitt"/>
+    <w:uiPriority w:val="99"/>
+    <w:unhideWhenUsed/>
+    <w:rsid w:val="00574747"/>
+    <w:rPr>
+      <w:color w:val="0000FF" w:themeColor="hyperlink"/>
+      <w:u w:val="single"/>
+    </w:rPr>
   </w:style>
 </w:styles>
 </file>
@@ -2715,6 +3009,10 @@
 </go:gDocsCustomXmlDataStorage>
 </file>
 
+<file path=customXml/item2.xml><?xml version="1.0" encoding="utf-8"?>
+<b:Sources xmlns:b="http://schemas.openxmlformats.org/officeDocument/2006/bibliography" xmlns="http://schemas.openxmlformats.org/officeDocument/2006/bibliography" SelectedStyle="\APASixthEditionOfficeOnline.xsl" StyleName="APA" Version="6"/>
+</file>
+
 <file path=customXml/itemProps1.xml><?xml version="1.0" encoding="utf-8"?>
 <ds:datastoreItem xmlns:ds="http://schemas.openxmlformats.org/officeDocument/2006/customXml" ds:itemID="{11111111-1234-1234-1234-123412341234}">
   <ds:schemaRefs>
@@ -2722,4 +3020,12 @@
     <ds:schemaRef ds:uri="http://schemas.openxmlformats.org/officeDocument/2006/relationships"/>
   </ds:schemaRefs>
 </ds:datastoreItem>
+</file>
+
+<file path=customXml/itemProps2.xml><?xml version="1.0" encoding="utf-8"?>
+<ds:datastoreItem xmlns:ds="http://schemas.openxmlformats.org/officeDocument/2006/customXml" ds:itemID="{0B219E4B-7EB7-4C72-8889-25DDB81C91EF}">
+  <ds:schemaRefs>
+    <ds:schemaRef ds:uri="http://schemas.openxmlformats.org/officeDocument/2006/bibliography"/>
+  </ds:schemaRefs>
+</ds:datastoreItem>
 </file>
</xml_diff>